<commit_message>
docs: reframe QSFD around validated findings and add Qiskit BB84 cross-validation
Rewrites README, both research notebooks, and the final DOCX report around
three research dimensions (QML design, system-level advantage, Layer1/Layer2
coexistence), replacing matplotlib box diagrams with Mermaid-rendered
architecture/workflow diagrams and adding explicit Establishes/Does-Not-
Establish framing throughout.

Also attempts a native liboqs PQC backend (unavailable in this environment --
no C/CMake toolchain, documented rather than hidden) and adds an independent,
circuit-level BB84 implementation using Qiskit + Qiskit Aer, which closely
reproduces the existing protocol-level simulator's QBER across all six tested
conditions (largest gap 0.62pp) and detects the intercept-resend eavesdropper
in 30/30 trials, without claiming physical QKD.
</commit_message>
<xml_diff>
--- a/Quantum_Secure_Fraud_Detection_System_Final_Report.docx
+++ b/Quantum_Secure_Fraud_Detection_System_Final_Report.docx
@@ -7,7 +7,7 @@
         <w:pStyle w:val="IEEETitle"/>
       </w:pPr>
       <w:r>
-        <w:t>Quantum-Secure Fraud Detection System: A Risk-Adaptive Architecture Connecting Classical/Quantum Fraud Intelligence to Post-Quantum Security</w:t>
+        <w:t>Quantum-Secure Fraud Detection System: An Empirical Study of Quantum Machine Learning, Post-Quantum Cryptography, and Risk-Adaptive Financial Security</w:t>
       </w:r>
     </w:p>
     <w:p>
@@ -47,13 +47,13 @@
         <w:pStyle w:val="IEEEAbtract"/>
       </w:pPr>
       <w:r>
-        <w:t>This project develops and empirically evaluates a two-layer research platform connecting behavioral fraud detection to risk-adaptive cryptographic security. Layer 1 combines classical machine learning (XGBoost, production) with a controlled quantum machine learning research program; a 20-seed paired experiment shows that a locality-motivated change to a quantum circuit's measurement observable produces a statistically significant improvement over a resource-matched baseline (bootstrap 95% CI excludes zero, Wilcoxon p=0.0086), while an equally rigorous classical-capacity-control experiment shows this improvement does not translate into a system-level predictive advantage over strong classical methods. Layer 2 implements and benchmarks classical cryptography (AES-256-GCM, RSA-3072, ECC/P-256), standardized post-quantum cryptography (ML-KEM-768, ML-DSA-65, SLH-DSA-SHA2-128s), and a BB84 quantum-key-distribution simulation. A pre-specified integration experiment connects the two layers through an auditable SecurityContext and finds that neither anomaly-assisted nor quantum-assisted security-routing signals clear a pre-committed cost budget on the tested data. No quantum advantage is claimed anywhere in this work; negative and null results are reported with the same rigor as positive ones.</w:t>
+        <w:t>This study investigates where quantum machine learning (QML), post-quantum cryptography (PQC), and simulated quantum key distribution (QKD) provide measurable value within an integrated, fraud-aware financial security architecture -- and where they do not. Rather than assuming quantum methods must outperform classical alternatives, controlled experiments with strong classical controls and pre-specified protocols are used to identify both benefits and boundaries. In Layer 1, a 20-seed paired experiment shows that changing a variational quantum circuit's measurement observable from a global to a local-sum formulation produces a statistically significant improvement in fraud-ranking performance (bootstrap 95% CI excludes zero, Wilcoxon p=0.0086, permutation p=0.0072); a subsequent classical capacity-control experiment shows this improvement does not extend to a verified system-level predictive advantage over the production XGBoost classifier. In Layer 2, classical cryptography (AES-256-GCM, RSA-3072, ECC/P-256), standardized post-quantum cryptography (ML-KEM-768, ML-DSA-65, SLH-DSA-SHA2-128s), and a BB84 QKD simulation are implemented and benchmarked. A pre-specified integration experiment connects the two layers through an auditable SecurityContext and finds that neither anomaly-assisted nor quantum-assisted security-routing signals clear a pre-committed cost budget on the tested data. No quantum advantage is claimed; negative and null results are reported with the same rigor as positive ones, and the study's principal architectural conclusion is that fraud risk and cryptographic-quantum-threat posture must be modeled as separate axes.</w:t>
       </w:r>
     </w:p>
     <w:p>
       <w:pPr/>
       <w:r>
-        <w:t>Keywords— fraud detection, quantum machine learning, post-quantum cryptography, BB84, risk-adaptive security, XGBoost, variational quantum circuits</w:t>
+        <w:t>Keywords— fraud detection, quantum machine learning, post-quantum cryptography, BB84, risk-adaptive security, XGBoost, variational quantum circuits, observable locality</w:t>
       </w:r>
     </w:p>
     <w:p>
@@ -69,7 +69,7 @@
         <w:pStyle w:val="IEEEParagraph"/>
       </w:pPr>
       <w:r>
-        <w:t>Financial transactions face two largely separately-studied risks: behavioral fraud and future cryptographic vulnerability to quantum computing. This project investigates both within a single connected architecture: a fraud-detection layer (Layer 1) whose output drives a risk-adaptive security layer (Layer 2), rather than treating the two as independent problems.</w:t>
+        <w:t>Financial transaction security faces two related but distinct challenges: behavioral fraud and the future vulnerability of public-key cryptography to quantum computers. This study motivates and investigates three related but distinct research dimensions: (A) whether quantum model design can improve a variational quantum fraud classifier's stability and predictive behavior; (B) whether such an improvement translates into predictive superiority over strong classical methods; and (C) how fraud intelligence, post-quantum cryptography, and simulated quantum key distribution can coexist within a single risk-adaptive architecture, and what trade-offs result.</w:t>
       </w:r>
     </w:p>
     <w:p>
@@ -77,7 +77,54 @@
         <w:pStyle w:val="IEEEParagraph"/>
       </w:pPr>
       <w:r>
-        <w:t>The project's originating requirements are recorded in its Software Requirements Specification, authored by the project team, and are traced against this implementation in full in the project's requirements traceability matrix. Two genuine specification gaps are disclosed rather than hidden: no web dashboard or API layer exists in this implementation, and the datasets actually used differ from the SRS's original dataset list (see Section III).</w:t>
+        <w:t>A central conceptual distinction motivates the system architecture: fraud risk ("how suspicious is this transaction?") is not equivalent to cryptographic quantum risk ("what protection should this transaction receive under the system's security policy?"). A transaction with low fraud probability is not thereby exempt from post-quantum protection, and a transaction with high fraud probability is not automatically more vulnerable to Shor's algorithm. This distinction, and the experiments that motivate it, are developed throughout this report.</w:t>
+      </w:r>
+    </w:p>
+    <w:p>
+      <w:pPr>
+        <w:jc w:val="center"/>
+      </w:pPr>
+      <w:r>
+        <w:drawing>
+          <wp:inline xmlns:a="http://schemas.openxmlformats.org/drawingml/2006/main" xmlns:pic="http://schemas.openxmlformats.org/drawingml/2006/picture">
+            <wp:extent cx="3017520" cy="3583800"/>
+            <wp:docPr id="1" name="Picture 1"/>
+            <wp:cNvGraphicFramePr>
+              <a:graphicFrameLocks noChangeAspect="1"/>
+            </wp:cNvGraphicFramePr>
+            <a:graphic>
+              <a:graphicData uri="http://schemas.openxmlformats.org/drawingml/2006/picture">
+                <pic:pic>
+                  <pic:nvPicPr>
+                    <pic:cNvPr id="0" name="overall_architecture.png"/>
+                    <pic:cNvPicPr/>
+                  </pic:nvPicPr>
+                  <pic:blipFill>
+                    <a:blip r:embed="rId12"/>
+                    <a:stretch>
+                      <a:fillRect/>
+                    </a:stretch>
+                  </pic:blipFill>
+                  <pic:spPr>
+                    <a:xfrm>
+                      <a:off x="0" y="0"/>
+                      <a:ext cx="3017520" cy="3583800"/>
+                    </a:xfrm>
+                    <a:prstGeom prst="rect"/>
+                  </pic:spPr>
+                </pic:pic>
+              </a:graphicData>
+            </a:graphic>
+          </wp:inline>
+        </w:drawing>
+      </w:r>
+    </w:p>
+    <w:p>
+      <w:pPr>
+        <w:pStyle w:val="IEEEFigureCaptionMulti-Lines"/>
+      </w:pPr>
+      <w:r>
+        <w:t>Fig. 1. Overall QSFD architecture. Every security profile, including BASELINE, applies full AES-256-GCM authenticated encryption plus a real key-establishment algorithm; fraud risk controls only additional protection layered on top.</w:t>
       </w:r>
     </w:p>
     <w:p>
@@ -85,7 +132,7 @@
         <w:pStyle w:val="IEEEHeading2"/>
       </w:pPr>
       <w:r>
-        <w:t>Problem Statement and Objectives</w:t>
+        <w:t>Research Gap</w:t>
       </w:r>
     </w:p>
     <w:p>
@@ -93,7 +140,7 @@
         <w:pStyle w:val="IEEEParagraph"/>
       </w:pPr>
       <w:r>
-        <w:t>Existing systems generally treat fraud detection and secure communication as separate technical problems. This project's objective is to determine, experimentally, whether behavioral fraud intelligence can be used to make cryptographic security orchestration more targeted and cost-effective, and separately, whether quantum computing provides any measurable predictive or operational advantage over strong classical methods at either layer.</w:t>
+        <w:t>Much existing work evaluates QML fraud detection, PQC, or QKD as separate technical problems. This study evaluates how these components behave when placed in a shared, risk-aware financial-security architecture, while subjecting the QML component to strong classical controls and formal statistical validation -- a combination not claimed here as unprecedented, but as methodologically distinguishing.</w:t>
       </w:r>
     </w:p>
     <w:p>
@@ -101,7 +148,7 @@
         <w:pStyle w:val="IEEEHeading1"/>
       </w:pPr>
       <w:r>
-        <w:t>System Architecture</w:t>
+        <w:t>Literature Review</w:t>
       </w:r>
     </w:p>
     <w:p>
@@ -109,7 +156,7 @@
         <w:pStyle w:val="IEEEParagraph"/>
       </w:pPr>
       <w:r>
-        <w:t>A transaction is preprocessed and passed to Layer 1's classical model (XGBoost, production) and, in an isolated research capacity, to a quantum-ML branch. Layer 1 emits a FraudAssessment (fraud probability, risk score/level, model metadata). Layer 2 converts this into a SecurityContext and a SecurityPolicyEngine selects one of four security profiles -- BASELINE, PQC_ENHANCED, HYBRID_MAXIMUM, or QKD_EXPERIMENTAL -- each layering additional protection on top of a security baseline that is never weakened, regardless of assessed fraud risk.</w:t>
+        <w:t>Six research sources were read in full and used to motivate specific experiments rather than being reproduced wholesale. Cerezo et al. [3] proved that global measurement observables cause harder-to-train quantum circuits even at shallow depth; this directly motivated the central Layer 1 finding reported in Section V. Kyriienko and Magnusson [4] proposed an unsupervised quantum-kernel anomaly detector on the identical Kaggle credit-card-fraud dataset used in this study; the corresponding experiment here found the approach did not replicate at scale. Data re-uploading [1] and barren-plateau initialization [2] were each tested as adapted experiments and did not improve on the existing baselines. NIST's FIPS 203/204/205 standards [6-8] define the post-quantum algorithms implemented in Layer 2, and Bennett and Brassard's original protocol description [9] is the basis for the Layer 2 BB84 simulation. One supplied reference document could not be read (a scanned, image-only PDF with no extractable text); its content is not guessed anywhere in this study.</w:t>
       </w:r>
     </w:p>
     <w:p>
@@ -117,7 +164,7 @@
         <w:pStyle w:val="IEEEHeading1"/>
       </w:pPr>
       <w:r>
-        <w:t>Requirements Traceability</w:t>
+        <w:t>Methodology</w:t>
       </w:r>
     </w:p>
     <w:p>
@@ -125,7 +172,62 @@
         <w:pStyle w:val="IEEEParagraph"/>
       </w:pPr>
       <w:r>
-        <w:t>Every functional, interface, and performance requirement in the project SRS was mapped to its implementation status. Of the independently verifiable requirements, the large majority are implemented; the most significant gap is the absence of any web dashboard or API layer, and a divergence between the SRS's specified dataset list (which includes network-intrusion datasets seemingly intended for a future attack-simulation layer) and the datasets this implementation actually uses. The full traceability matrix is provided as project documentation.</w:t>
+        <w:t>Layer 1 uses the Kaggle creditcardfraud dataset (284,807 transactions, 0.173% fraud) with a temporal train/validation/test split, duplicate removal prior to splitting, and preprocessing fit exclusively on the training fold. Four classical models were evaluated; XGBoost was selected for production owing to substantially lower latency at a statistically indistinguishable predictive difference from Random Forest. A quantum research branch evaluated QSVM, VQC, and QNN architectures on a locked, rebalanced controlled subset, culminating in a 20-seed paired experiment (identical initialization per seed across both arms) comparing a global-observable QNN against a local-sum-observable QNN, validated with paired bootstrap, Wilcoxon signed-rank, and permutation tests, then cross-checked against a matched classical nonlinear capacity control.</w:t>
+      </w:r>
+    </w:p>
+    <w:p>
+      <w:pPr>
+        <w:jc w:val="center"/>
+      </w:pPr>
+      <w:r>
+        <w:drawing>
+          <wp:inline xmlns:a="http://schemas.openxmlformats.org/drawingml/2006/main" xmlns:pic="http://schemas.openxmlformats.org/drawingml/2006/picture">
+            <wp:extent cx="2377440" cy="22684740"/>
+            <wp:docPr id="2" name="Picture 2"/>
+            <wp:cNvGraphicFramePr>
+              <a:graphicFrameLocks noChangeAspect="1"/>
+            </wp:cNvGraphicFramePr>
+            <a:graphic>
+              <a:graphicData uri="http://schemas.openxmlformats.org/drawingml/2006/picture">
+                <pic:pic>
+                  <pic:nvPicPr>
+                    <pic:cNvPr id="0" name="layer1_experimental_workflow.png"/>
+                    <pic:cNvPicPr/>
+                  </pic:nvPicPr>
+                  <pic:blipFill>
+                    <a:blip r:embed="rId13"/>
+                    <a:stretch>
+                      <a:fillRect/>
+                    </a:stretch>
+                  </pic:blipFill>
+                  <pic:spPr>
+                    <a:xfrm>
+                      <a:off x="0" y="0"/>
+                      <a:ext cx="2377440" cy="22684740"/>
+                    </a:xfrm>
+                    <a:prstGeom prst="rect"/>
+                  </pic:spPr>
+                </pic:pic>
+              </a:graphicData>
+            </a:graphic>
+          </wp:inline>
+        </w:drawing>
+      </w:r>
+    </w:p>
+    <w:p>
+      <w:pPr>
+        <w:pStyle w:val="IEEEFigureCaptionMulti-Lines"/>
+      </w:pPr>
+      <w:r>
+        <w:t>Fig. 2. Layer 1 experimental workflow. Each stage exists to test a specific hypothesis; rejected hypotheses (re-uploading, near-zero initialization, the anomaly detector at scale) narrowed the research question toward the Local-Sum observable candidate.</w:t>
+      </w:r>
+    </w:p>
+    <w:p>
+      <w:pPr>
+        <w:pStyle w:val="IEEEParagraph"/>
+      </w:pPr>
+      <w:r>
+        <w:t>Layer 2 implements AES-256-GCM, RSA-3072, and ECC/P-256 via the `cryptography` package, and ML-KEM-768, ML-DSA-65, and SLH-DSA-SHA2-128s via pure-Python reference implementations (native liboqs could not be built without a C toolchain in the development environment). All cryptographic operations were benchmarked with 30 repetitions (reduced to 5 for SLH-DSA signing given its substantial per-call cost). BB84 was implemented as a classical simulation of the protocol's sifting and quantum-bit-error-rate estimation procedure, evaluated across 30 trials per tested condition. The Layer 1-to-Layer 2 integration experiment's policy formulations, data samples, metrics, and selection criterion were committed to a written protocol before the experiment was executed.</w:t>
       </w:r>
     </w:p>
     <w:p>
@@ -133,7 +235,7 @@
         <w:pStyle w:val="IEEEHeading1"/>
       </w:pPr>
       <w:r>
-        <w:t>Literature Review</w:t>
+        <w:t>Layer 1: Fraud Detection Methodology and Equations</w:t>
       </w:r>
     </w:p>
     <w:p>
@@ -141,31 +243,340 @@
         <w:pStyle w:val="IEEEParagraph"/>
       </w:pPr>
       <w:r>
-        <w:t>Six research sources were read in full and used to motivate specific experiments in this project (rather than being reproduced wholesale). Cerezo et al. [3] proved that global measurement observables cause harder-to-train quantum circuits even at shallow depth; this directly motivated this project's central Layer 1 finding (Section VI). Kyriienko and Magnusson [4] proposed an unsupervised quantum-kernel anomaly detector on the identical Kaggle credit-card-fraud dataset this project uses; the corresponding experiment here found the approach did not replicate at scale. Data re-uploading [1] and barren-plateau initialization [2] were each tested as adapted experiments and did not improve on this project's existing baselines. NIST's FIPS 203/204/205 standards [6-8] define the post-quantum algorithms implemented in Layer 2, and the original BB84 protocol description [9] is the basis for Layer 2's quantum-key-distribution simulation. One supplied reference document could not be read (a scanned, image-only PDF with no extractable text) and its content is not guessed anywhere in this project.</w:t>
-      </w:r>
-    </w:p>
-    <w:p>
-      <w:pPr>
-        <w:pStyle w:val="IEEEHeading1"/>
-      </w:pPr>
-      <w:r>
-        <w:t>Methodology</w:t>
+        <w:t>For imbalanced classification, the primary evaluation metric is PR-AUC rather than accuracy or ROC-AUC, computed from:</w:t>
       </w:r>
     </w:p>
     <w:p>
       <w:pPr>
         <w:pStyle w:val="IEEEParagraph"/>
-      </w:pPr>
-      <w:r>
-        <w:t>Layer 1 uses the Kaggle creditcardfraud dataset (284,807 transactions, 0.173% fraud) with a temporal train/validation/test split, duplicate removal prior to splitting, and preprocessing fit exclusively on the training fold. Four classical models were evaluated (Logistic Regression, Random Forest, XGBoost, Isolation Forest); XGBoost was selected for production owing to a substantially lower single-transaction latency at a statistically indistinguishable predictive difference from Random Forest. A parallel quantum research branch evaluated QSVM, VQC, and QNN architectures on a locked, rebalanced controlled subset, culminating in a 20-seed paired experiment (identical initialization per seed across both arms) comparing a global-observable QNN against a local-sum-observable QNN, validated with paired bootstrap, Wilcoxon signed-rank, and permutation tests, and cross-checked against a matched classical nonlinear capacity control.</w:t>
+        <w:jc w:val="center"/>
+      </w:pPr>
+      <w:r>
+        <w:rPr>
+          <w:i/>
+        </w:rPr>
+        <w:t>Precision = TP / (TP + FP)      Recall = TP / (TP + FN)</w:t>
+      </w:r>
+      <w:r>
+        <w:rPr>
+          <w:i w:val="0"/>
+        </w:rPr>
+        <w:tab/>
+        <w:t>(1)</w:t>
       </w:r>
     </w:p>
     <w:p>
       <w:pPr>
         <w:pStyle w:val="IEEEParagraph"/>
-      </w:pPr>
-      <w:r>
-        <w:t>Layer 2 implements AES-256-GCM, RSA-3072, and ECC/P-256 via the maintained `cryptography` package, and ML-KEM-768, ML-DSA-65, and SLH-DSA-SHA2-128s via pure-Python reference implementations (native liboqs could not be built without a C toolchain in the development environment). All cryptographic operations were benchmarked with 30 repetitions (reduced to 5 for SLH-DSA signing given its substantial per-call cost). BB84 was implemented as a classical simulation of the protocol's sifting and quantum-bit-error-rate estimation procedure, evaluated across 30 trials per tested condition. The Layer 1-to-Layer 2 integration experiment's policy formulations, data samples, metrics, and selection criterion were all committed to a written protocol before the experiment was executed, specifically to prevent post-hoc selection of a favorable result.</w:t>
+        <w:jc w:val="center"/>
+      </w:pPr>
+      <w:r>
+        <w:rPr>
+          <w:i/>
+        </w:rPr>
+        <w:t>F1 = 2 * Precision * Recall / (Precision + Recall)</w:t>
+      </w:r>
+      <w:r>
+        <w:rPr>
+          <w:i w:val="0"/>
+        </w:rPr>
+        <w:tab/>
+        <w:t>(2)</w:t>
+      </w:r>
+    </w:p>
+    <w:p>
+      <w:pPr>
+        <w:pStyle w:val="IEEEParagraph"/>
+      </w:pPr>
+      <w:r>
+        <w:t>The quantum models encode a classical feature vector into a parameterized quantum state and read out an expectation value:</w:t>
+      </w:r>
+    </w:p>
+    <w:p>
+      <w:pPr>
+        <w:pStyle w:val="IEEEParagraph"/>
+        <w:jc w:val="center"/>
+      </w:pPr>
+      <w:r>
+        <w:rPr>
+          <w:i/>
+        </w:rPr>
+        <w:t>|psi(x,theta)&gt; = V(theta) . U_enc(x) |0&gt;^(xn)</w:t>
+      </w:r>
+      <w:r>
+        <w:rPr>
+          <w:i w:val="0"/>
+        </w:rPr>
+        <w:tab/>
+        <w:t>(3)</w:t>
+      </w:r>
+    </w:p>
+    <w:p>
+      <w:pPr>
+        <w:pStyle w:val="IEEEParagraph"/>
+        <w:jc w:val="center"/>
+      </w:pPr>
+      <w:r>
+        <w:rPr>
+          <w:i/>
+        </w:rPr>
+        <w:t>f_theta(x) = &lt;psi(x,theta)| O |psi(x,theta)&gt;</w:t>
+      </w:r>
+      <w:r>
+        <w:rPr>
+          <w:i w:val="0"/>
+        </w:rPr>
+        <w:tab/>
+        <w:t>(4)</w:t>
+      </w:r>
+    </w:p>
+    <w:p>
+      <w:pPr>
+        <w:pStyle w:val="IEEEParagraph"/>
+      </w:pPr>
+      <w:r>
+        <w:t>where O is the measured observable. The project's existing QNN implicitly used a global observable (the qiskit-machine-learning default):</w:t>
+      </w:r>
+    </w:p>
+    <w:p>
+      <w:pPr>
+        <w:pStyle w:val="IEEEParagraph"/>
+        <w:jc w:val="center"/>
+      </w:pPr>
+      <w:r>
+        <w:rPr>
+          <w:i/>
+        </w:rPr>
+        <w:t>O_global = Z_0 (x) Z_1 (x) ... (x) Z_(n-1)</w:t>
+      </w:r>
+      <w:r>
+        <w:rPr>
+          <w:i w:val="0"/>
+        </w:rPr>
+        <w:tab/>
+        <w:t>(5)</w:t>
+      </w:r>
+    </w:p>
+    <w:p>
+      <w:pPr>
+        <w:pStyle w:val="IEEEParagraph"/>
+      </w:pPr>
+      <w:r>
+        <w:t>The tested alternative, motivated by Cerezo et al. [3], is a local-sum observable:</w:t>
+      </w:r>
+    </w:p>
+    <w:p>
+      <w:pPr>
+        <w:pStyle w:val="IEEEParagraph"/>
+        <w:jc w:val="center"/>
+      </w:pPr>
+      <w:r>
+        <w:rPr>
+          <w:i/>
+        </w:rPr>
+        <w:t>O_local-sum = (1/n) * sum_{i=0}^{n-1} Z_i</w:t>
+      </w:r>
+      <w:r>
+        <w:rPr>
+          <w:i w:val="0"/>
+        </w:rPr>
+        <w:tab/>
+        <w:t>(6)</w:t>
+      </w:r>
+    </w:p>
+    <w:p>
+      <w:pPr>
+        <w:jc w:val="center"/>
+      </w:pPr>
+      <w:r>
+        <w:drawing>
+          <wp:inline xmlns:a="http://schemas.openxmlformats.org/drawingml/2006/main" xmlns:pic="http://schemas.openxmlformats.org/drawingml/2006/picture">
+            <wp:extent cx="2926080" cy="2251227"/>
+            <wp:docPr id="3" name="Picture 3"/>
+            <wp:cNvGraphicFramePr>
+              <a:graphicFrameLocks noChangeAspect="1"/>
+            </wp:cNvGraphicFramePr>
+            <a:graphic>
+              <a:graphicData uri="http://schemas.openxmlformats.org/drawingml/2006/picture">
+                <pic:pic>
+                  <pic:nvPicPr>
+                    <pic:cNvPr id="0" name="global_vs_localsum_diagram.png"/>
+                    <pic:cNvPicPr/>
+                  </pic:nvPicPr>
+                  <pic:blipFill>
+                    <a:blip r:embed="rId14"/>
+                    <a:stretch>
+                      <a:fillRect/>
+                    </a:stretch>
+                  </pic:blipFill>
+                  <pic:spPr>
+                    <a:xfrm>
+                      <a:off x="0" y="0"/>
+                      <a:ext cx="2926080" cy="2251227"/>
+                    </a:xfrm>
+                    <a:prstGeom prst="rect"/>
+                  </pic:spPr>
+                </pic:pic>
+              </a:graphicData>
+            </a:graphic>
+          </wp:inline>
+        </w:drawing>
+      </w:r>
+    </w:p>
+    <w:p>
+      <w:pPr>
+        <w:pStyle w:val="IEEEFigureCaptionMulti-Lines"/>
+      </w:pPr>
+      <w:r>
+        <w:t>Fig. 3. Global vs. local-sum measurement strategy on an identical circuit -- only the measured observable differs between the two arms of the paired experiment.</w:t>
+      </w:r>
+    </w:p>
+    <w:p>
+      <w:pPr>
+        <w:pStyle w:val="IEEEParagraph"/>
+      </w:pPr>
+      <w:r>
+        <w:t>The paired per-seed improvement and its mean across 20 seeds are:</w:t>
+      </w:r>
+    </w:p>
+    <w:p>
+      <w:pPr>
+        <w:pStyle w:val="IEEEParagraph"/>
+        <w:jc w:val="center"/>
+      </w:pPr>
+      <w:r>
+        <w:rPr>
+          <w:i/>
+        </w:rPr>
+        <w:t>Delta_i = PR-AUC_LocalSum,i  -  PR-AUC_Global,i,   i = 1..20</w:t>
+      </w:r>
+      <w:r>
+        <w:rPr>
+          <w:i w:val="0"/>
+        </w:rPr>
+        <w:tab/>
+        <w:t>(7)</w:t>
+      </w:r>
+    </w:p>
+    <w:p>
+      <w:pPr>
+        <w:pStyle w:val="IEEEParagraph"/>
+        <w:jc w:val="center"/>
+      </w:pPr>
+      <w:r>
+        <w:rPr>
+          <w:i/>
+        </w:rPr>
+        <w:t>Delta_bar = (1/20) * sum_i Delta_i</w:t>
+      </w:r>
+      <w:r>
+        <w:rPr>
+          <w:i w:val="0"/>
+        </w:rPr>
+        <w:tab/>
+        <w:t>(8)</w:t>
+      </w:r>
+    </w:p>
+    <w:p>
+      <w:pPr>
+        <w:pStyle w:val="IEEEParagraph"/>
+      </w:pPr>
+      <w:r>
+        <w:t>with uncertainty estimated by a 5000-resample bootstrap over the 20 seeds, and significance assessed with a one-sided Wilcoxon signed-rank test and a sign-flip permutation test.</w:t>
+      </w:r>
+    </w:p>
+    <w:p>
+      <w:pPr>
+        <w:jc w:val="center"/>
+      </w:pPr>
+      <w:r>
+        <w:drawing>
+          <wp:inline xmlns:a="http://schemas.openxmlformats.org/drawingml/2006/main" xmlns:pic="http://schemas.openxmlformats.org/drawingml/2006/picture">
+            <wp:extent cx="3017520" cy="619063"/>
+            <wp:docPr id="4" name="Picture 4"/>
+            <wp:cNvGraphicFramePr>
+              <a:graphicFrameLocks noChangeAspect="1"/>
+            </wp:cNvGraphicFramePr>
+            <a:graphic>
+              <a:graphicData uri="http://schemas.openxmlformats.org/drawingml/2006/picture">
+                <pic:pic>
+                  <pic:nvPicPr>
+                    <pic:cNvPr id="0" name="circuit_qnn_linear.png"/>
+                    <pic:cNvPicPr/>
+                  </pic:nvPicPr>
+                  <pic:blipFill>
+                    <a:blip r:embed="rId15"/>
+                    <a:stretch>
+                      <a:fillRect/>
+                    </a:stretch>
+                  </pic:blipFill>
+                  <pic:spPr>
+                    <a:xfrm>
+                      <a:off x="0" y="0"/>
+                      <a:ext cx="3017520" cy="619063"/>
+                    </a:xfrm>
+                    <a:prstGeom prst="rect"/>
+                  </pic:spPr>
+                </pic:pic>
+              </a:graphicData>
+            </a:graphic>
+          </wp:inline>
+        </w:drawing>
+      </w:r>
+    </w:p>
+    <w:p>
+      <w:pPr>
+        <w:pStyle w:val="IEEEFigureCaptionMulti-Lines"/>
+      </w:pPr>
+      <w:r>
+        <w:t>Fig. 4. Global-observable QNN circuit as actually implemented (4 qubits, linear entangling topology, ZZ-style feature encoding followed by a RealAmplitudes-style ansatz).</w:t>
+      </w:r>
+    </w:p>
+    <w:p>
+      <w:pPr>
+        <w:jc w:val="center"/>
+      </w:pPr>
+      <w:r>
+        <w:drawing>
+          <wp:inline xmlns:a="http://schemas.openxmlformats.org/drawingml/2006/main" xmlns:pic="http://schemas.openxmlformats.org/drawingml/2006/picture">
+            <wp:extent cx="3017520" cy="1233136"/>
+            <wp:docPr id="5" name="Picture 5"/>
+            <wp:cNvGraphicFramePr>
+              <a:graphicFrameLocks noChangeAspect="1"/>
+            </wp:cNvGraphicFramePr>
+            <a:graphic>
+              <a:graphicData uri="http://schemas.openxmlformats.org/drawingml/2006/picture">
+                <pic:pic>
+                  <pic:nvPicPr>
+                    <pic:cNvPr id="0" name="circuit_qnn_clt.png"/>
+                    <pic:cNvPicPr/>
+                  </pic:nvPicPr>
+                  <pic:blipFill>
+                    <a:blip r:embed="rId16"/>
+                    <a:stretch>
+                      <a:fillRect/>
+                    </a:stretch>
+                  </pic:blipFill>
+                  <pic:spPr>
+                    <a:xfrm>
+                      <a:off x="0" y="0"/>
+                      <a:ext cx="3017520" cy="1233136"/>
+                    </a:xfrm>
+                    <a:prstGeom prst="rect"/>
+                  </pic:spPr>
+                </pic:pic>
+              </a:graphicData>
+            </a:graphic>
+          </wp:inline>
+        </w:drawing>
+      </w:r>
+    </w:p>
+    <w:p>
+      <w:pPr>
+        <w:pStyle w:val="IEEEFigureCaptionMulti-Lines"/>
+      </w:pPr>
+      <w:r>
+        <w:t>Fig. 5. Chow-Liu-structured QNN circuit -- entanglement pairs determined by mutual-information structure learned from the training data, rather than a generic topology.</w:t>
       </w:r>
     </w:p>
     <w:p>
@@ -241,7 +652,7 @@
               <w:pStyle w:val="IEEETableHeaderCentered"/>
             </w:pPr>
             <w:r>
-              <w:t>roc_au</w:t>
+              <w:t>roc_auc</w:t>
             </w:r>
           </w:p>
         </w:tc>
@@ -254,7 +665,7 @@
               <w:pStyle w:val="IEEETableHeaderCentered"/>
             </w:pPr>
             <w:r>
-              <w:t>precis</w:t>
+              <w:t>precision</w:t>
             </w:r>
           </w:p>
         </w:tc>
@@ -543,26 +954,104 @@
     </w:tbl>
     <w:p>
       <w:pPr>
+        <w:jc w:val="center"/>
+      </w:pPr>
+      <w:r>
+        <w:drawing>
+          <wp:inline xmlns:a="http://schemas.openxmlformats.org/drawingml/2006/main" xmlns:pic="http://schemas.openxmlformats.org/drawingml/2006/picture">
+            <wp:extent cx="3017520" cy="1079663"/>
+            <wp:docPr id="6" name="Picture 6"/>
+            <wp:cNvGraphicFramePr>
+              <a:graphicFrameLocks noChangeAspect="1"/>
+            </wp:cNvGraphicFramePr>
+            <a:graphic>
+              <a:graphicData uri="http://schemas.openxmlformats.org/drawingml/2006/picture">
+                <pic:pic>
+                  <pic:nvPicPr>
+                    <pic:cNvPr id="0" name="classical_model_comparison.png"/>
+                    <pic:cNvPicPr/>
+                  </pic:nvPicPr>
+                  <pic:blipFill>
+                    <a:blip r:embed="rId17"/>
+                    <a:stretch>
+                      <a:fillRect/>
+                    </a:stretch>
+                  </pic:blipFill>
+                  <pic:spPr>
+                    <a:xfrm>
+                      <a:off x="0" y="0"/>
+                      <a:ext cx="3017520" cy="1079663"/>
+                    </a:xfrm>
+                    <a:prstGeom prst="rect"/>
+                  </pic:spPr>
+                </pic:pic>
+              </a:graphicData>
+            </a:graphic>
+          </wp:inline>
+        </w:drawing>
+      </w:r>
+    </w:p>
+    <w:p>
+      <w:pPr>
+        <w:pStyle w:val="IEEEFigureCaptionMulti-Lines"/>
+      </w:pPr>
+      <w:r>
+        <w:t>Fig. 6. PR-AUC and single-transaction latency across all four classical models. XGBoost is selected for production for its latency advantage, not the highest point-estimate PR-AUC.</w:t>
+      </w:r>
+    </w:p>
+    <w:p>
+      <w:pPr>
         <w:pStyle w:val="IEEEParagraph"/>
       </w:pPr>
       <w:r>
-        <w:t>The decisive quantum-architecture experiment compared a global-observable QNN (mean PR-AUC 0.8077, standard deviation 0.073 across 20 seeds) against a local-sum-observable QNN (mean PR-AUC 0.8612, standard deviation 0.051), on an independent, previously-unseen confirmation split. The paired mean delta was +0.0536 PR-AUC, with a 5000-resample bootstrap 95% confidence interval of [+0.0149, +0.0913] that excludes zero, a one-sided Wilcoxon signed-rank p-value of 0.0086, and a sign-flip permutation p-value of 0.0072; the local-sum observable won 13 of the 20 seeds, and the result was not driven by any single outlier seed. Gradient diagnostics, computed directly from the trained circuit at four checkpoints per seed, showed the local-sum observable's gradient norm was consistently smaller and less variable across seeds than the global observable's at every checkpoint -- evidence consistent with reduced optimization variance, not with a change in gradient magnitude that would indicate barren-plateau avoidance.</w:t>
-      </w:r>
-    </w:p>
-    <w:p>
-      <w:pPr>
-        <w:pStyle w:val="IEEEParagraph"/>
-      </w:pPr>
-      <w:r>
-        <w:t>This architecture-level result was then tested for system-level relevance. Stacking the production XGBoost model with the local-sum QNN's score (via out-of-fold logistic-regression meta-learning) produced a PR-AUC of 0.9665 on the locked confirmation split, against 0.9613 for XGBoost alone (95% bootstrap CI [-0.0035, +0.0173], crossing zero) and 0.9671 for XGBoost stacked with a matched-capacity classical nonlinear control -- the classical control's point estimate exceeded the quantum-augmented ensemble's. Every other quantum architecture evaluated in this project -- QSVM, VQC, Chow-Liu-structured circuits, QBoost, five hybrid fusion architectures, and a quantum-kernel anomaly detector -- likewise failed to establish a statistically supported predictive advantage over its classical counterpart; the anomaly detector's promising small-scale result was found not to replicate when re-tested at a larger, independent scale.</w:t>
-      </w:r>
-    </w:p>
-    <w:p>
-      <w:pPr>
-        <w:pStyle w:val="IEEEHeading1"/>
-      </w:pPr>
-      <w:r>
-        <w:t>Layer 2: Results</w:t>
+        <w:t>The decisive quantum-architecture experiment compared a global-observable QNN (mean PR-AUC 0.8077, standard deviation 0.073 across 20 seeds) against a local-sum-observable QNN (mean PR-AUC 0.8612, standard deviation 0.051) on an independent, previously-unseen confirmation split.</w:t>
+      </w:r>
+    </w:p>
+    <w:p>
+      <w:pPr>
+        <w:jc w:val="center"/>
+      </w:pPr>
+      <w:r>
+        <w:drawing>
+          <wp:inline xmlns:a="http://schemas.openxmlformats.org/drawingml/2006/main" xmlns:pic="http://schemas.openxmlformats.org/drawingml/2006/picture">
+            <wp:extent cx="3108960" cy="1149531"/>
+            <wp:docPr id="7" name="Picture 7"/>
+            <wp:cNvGraphicFramePr>
+              <a:graphicFrameLocks noChangeAspect="1"/>
+            </wp:cNvGraphicFramePr>
+            <a:graphic>
+              <a:graphicData uri="http://schemas.openxmlformats.org/drawingml/2006/picture">
+                <pic:pic>
+                  <pic:nvPicPr>
+                    <pic:cNvPr id="0" name="paired_seed_deltas.png"/>
+                    <pic:cNvPicPr/>
+                  </pic:nvPicPr>
+                  <pic:blipFill>
+                    <a:blip r:embed="rId18"/>
+                    <a:stretch>
+                      <a:fillRect/>
+                    </a:stretch>
+                  </pic:blipFill>
+                  <pic:spPr>
+                    <a:xfrm>
+                      <a:off x="0" y="0"/>
+                      <a:ext cx="3108960" cy="1149531"/>
+                    </a:xfrm>
+                    <a:prstGeom prst="rect"/>
+                  </pic:spPr>
+                </pic:pic>
+              </a:graphicData>
+            </a:graphic>
+          </wp:inline>
+        </w:drawing>
+      </w:r>
+    </w:p>
+    <w:p>
+      <w:pPr>
+        <w:pStyle w:val="IEEEFigureCaptionMulti-Lines"/>
+      </w:pPr>
+      <w:r>
+        <w:t>Fig. 7. Paired PR-AUC comparison between the Global-observable and Local-Sum QNN across 20 matched random seeds (left) and the resulting delta distribution (right). The Local-Sum configuration achieves a positive mean paired difference in 13 of 20 seeds.</w:t>
       </w:r>
     </w:p>
     <w:p>
@@ -578,7 +1067,7 @@
         <w:pStyle w:val="IEEETableCaption"/>
       </w:pPr>
       <w:r>
-        <w:t>Signature Sizes by Algorithm (bytes)</w:t>
+        <w:t>Paired Statistical Validation, Global vs. Local-Sum QNN</w:t>
       </w:r>
     </w:p>
     <w:tbl>
@@ -601,7 +1090,7 @@
               <w:pStyle w:val="IEEETableHeaderCentered"/>
             </w:pPr>
             <w:r>
-              <w:t>Algorithm</w:t>
+              <w:t>Statistic</w:t>
             </w:r>
           </w:p>
         </w:tc>
@@ -614,7 +1103,7 @@
               <w:pStyle w:val="IEEETableHeaderCentered"/>
             </w:pPr>
             <w:r>
-              <w:t>Size (bytes)</w:t>
+              <w:t>Value</w:t>
             </w:r>
           </w:p>
         </w:tc>
@@ -629,7 +1118,7 @@
               <w:pStyle w:val="IEEETableCell"/>
             </w:pPr>
             <w:r>
-              <w:t>RSA-3072-PSS</w:t>
+              <w:t>Mean paired delta</w:t>
             </w:r>
           </w:p>
         </w:tc>
@@ -642,7 +1131,7 @@
               <w:pStyle w:val="IEEETableCell"/>
             </w:pPr>
             <w:r>
-              <w:t>384</w:t>
+              <w:t>+0.0536</w:t>
             </w:r>
           </w:p>
         </w:tc>
@@ -657,7 +1146,7 @@
               <w:pStyle w:val="IEEETableCell"/>
             </w:pPr>
             <w:r>
-              <w:t>ECDSA-P256</w:t>
+              <w:t>Bootstrap 95% CI</w:t>
             </w:r>
           </w:p>
         </w:tc>
@@ -670,7 +1159,7 @@
               <w:pStyle w:val="IEEETableCell"/>
             </w:pPr>
             <w:r>
-              <w:t>70</w:t>
+              <w:t>[+0.0149, +0.0913]</w:t>
             </w:r>
           </w:p>
         </w:tc>
@@ -685,7 +1174,7 @@
               <w:pStyle w:val="IEEETableCell"/>
             </w:pPr>
             <w:r>
-              <w:t>ML-DSA-65</w:t>
+              <w:t>Wilcoxon p (one-sided)</w:t>
             </w:r>
           </w:p>
         </w:tc>
@@ -698,7 +1187,7 @@
               <w:pStyle w:val="IEEETableCell"/>
             </w:pPr>
             <w:r>
-              <w:t>3309</w:t>
+              <w:t>0.0086</w:t>
             </w:r>
           </w:p>
         </w:tc>
@@ -713,7 +1202,7 @@
               <w:pStyle w:val="IEEETableCell"/>
             </w:pPr>
             <w:r>
-              <w:t>SLH-DSA-SHA2-128s</w:t>
+              <w:t>Permutation p (one-sided)</w:t>
             </w:r>
           </w:p>
         </w:tc>
@@ -726,7 +1215,35 @@
               <w:pStyle w:val="IEEETableCell"/>
             </w:pPr>
             <w:r>
-              <w:t>7856</w:t>
+              <w:t>0.0072</w:t>
+            </w:r>
+          </w:p>
+        </w:tc>
+      </w:tr>
+      <w:tr>
+        <w:tc>
+          <w:tcPr>
+            <w:tcW w:type="dxa" w:w="5142"/>
+          </w:tcPr>
+          <w:p>
+            <w:pPr>
+              <w:pStyle w:val="IEEETableCell"/>
+            </w:pPr>
+            <w:r>
+              <w:t>Seed wins (Local-Sum)</w:t>
+            </w:r>
+          </w:p>
+        </w:tc>
+        <w:tc>
+          <w:tcPr>
+            <w:tcW w:type="dxa" w:w="5142"/>
+          </w:tcPr>
+          <w:p>
+            <w:pPr>
+              <w:pStyle w:val="IEEETableCell"/>
+            </w:pPr>
+            <w:r>
+              <w:t>13 / 20</w:t>
             </w:r>
           </w:p>
         </w:tc>
@@ -734,10 +1251,57 @@
     </w:tbl>
     <w:p>
       <w:pPr>
+        <w:jc w:val="center"/>
+      </w:pPr>
+      <w:r>
+        <w:drawing>
+          <wp:inline xmlns:a="http://schemas.openxmlformats.org/drawingml/2006/main" xmlns:pic="http://schemas.openxmlformats.org/drawingml/2006/picture">
+            <wp:extent cx="2926080" cy="1754923"/>
+            <wp:docPr id="8" name="Picture 8"/>
+            <wp:cNvGraphicFramePr>
+              <a:graphicFrameLocks noChangeAspect="1"/>
+            </wp:cNvGraphicFramePr>
+            <a:graphic>
+              <a:graphicData uri="http://schemas.openxmlformats.org/drawingml/2006/picture">
+                <pic:pic>
+                  <pic:nvPicPr>
+                    <pic:cNvPr id="0" name="gradient_diagnostics.png"/>
+                    <pic:cNvPicPr/>
+                  </pic:nvPicPr>
+                  <pic:blipFill>
+                    <a:blip r:embed="rId19"/>
+                    <a:stretch>
+                      <a:fillRect/>
+                    </a:stretch>
+                  </pic:blipFill>
+                  <pic:spPr>
+                    <a:xfrm>
+                      <a:off x="0" y="0"/>
+                      <a:ext cx="2926080" cy="1754923"/>
+                    </a:xfrm>
+                    <a:prstGeom prst="rect"/>
+                  </pic:spPr>
+                </pic:pic>
+              </a:graphicData>
+            </a:graphic>
+          </wp:inline>
+        </w:drawing>
+      </w:r>
+    </w:p>
+    <w:p>
+      <w:pPr>
+        <w:pStyle w:val="IEEEFigureCaptionMulti-Lines"/>
+      </w:pPr>
+      <w:r>
+        <w:t>Fig. 8. Gradient norm by training checkpoint, Global vs. Local-Sum observable. The Local-Sum observable shows consistently smaller and less variable gradients -- consistent with improved optimization stability, not with a change in gradient magnitude indicating barren-plateau elimination.</w:t>
+      </w:r>
+    </w:p>
+    <w:p>
+      <w:pPr>
         <w:pStyle w:val="IEEEParagraph"/>
       </w:pPr>
       <w:r>
-        <w:t>Post-quantum signatures are substantially larger than their classical counterparts: ML-DSA-65's signature (3309 bytes) is approximately 47 times ECDSA's (70 bytes), and SLH-DSA-SHA2-128s's signature (7856 bytes) is approximately 112 times larger. ML-DSA-65 signing exhibited a genuinely large runtime variance (86 to 1494 milliseconds across 30 repetitions), attributable to the scheme's Fiat-Shamir-with-aborts rejection sampling rather than measurement noise. SLH-DSA signing required approximately 15 seconds per call in this pure-Python implementation -- a cost arising both from the inherent expense of stateless hash-based signatures and the absence of a native, hardware-accelerated implementation in the development environment; this figure should not be generalized to production-grade post-quantum libraries.</w:t>
+        <w:t>This architecture-level result was then tested for system-level relevance against a matched classical nonlinear capacity control.</w:t>
       </w:r>
     </w:p>
     <w:p>
@@ -746,6 +1310,858 @@
       </w:pPr>
       <w:r>
         <w:t>TABLE III</w:t>
+      </w:r>
+    </w:p>
+    <w:p>
+      <w:pPr>
+        <w:pStyle w:val="IEEETableCaption"/>
+      </w:pPr>
+      <w:r>
+        <w:t>Classical Capacity Control (Locked Confirmation Split)</w:t>
+      </w:r>
+    </w:p>
+    <w:tbl>
+      <w:tblPr>
+        <w:tblStyle w:val="TableGrid"/>
+        <w:tblW w:type="auto" w:w="0"/>
+        <w:tblLook w:firstColumn="1" w:firstRow="1" w:lastColumn="0" w:lastRow="0" w:noHBand="0" w:noVBand="1" w:val="04A0"/>
+      </w:tblPr>
+      <w:tblGrid>
+        <w:gridCol w:w="5142"/>
+        <w:gridCol w:w="5142"/>
+      </w:tblGrid>
+      <w:tr>
+        <w:tc>
+          <w:tcPr>
+            <w:tcW w:type="dxa" w:w="5142"/>
+          </w:tcPr>
+          <w:p>
+            <w:pPr>
+              <w:pStyle w:val="IEEETableHeaderCentered"/>
+            </w:pPr>
+            <w:r>
+              <w:t>Architecture</w:t>
+            </w:r>
+          </w:p>
+        </w:tc>
+        <w:tc>
+          <w:tcPr>
+            <w:tcW w:type="dxa" w:w="5142"/>
+          </w:tcPr>
+          <w:p>
+            <w:pPr>
+              <w:pStyle w:val="IEEETableHeaderCentered"/>
+            </w:pPr>
+            <w:r>
+              <w:t>PR-AUC</w:t>
+            </w:r>
+          </w:p>
+        </w:tc>
+      </w:tr>
+      <w:tr>
+        <w:tc>
+          <w:tcPr>
+            <w:tcW w:type="dxa" w:w="5142"/>
+          </w:tcPr>
+          <w:p>
+            <w:pPr>
+              <w:pStyle w:val="IEEETableCell"/>
+            </w:pPr>
+            <w:r>
+              <w:t>XGBoost alone</w:t>
+            </w:r>
+          </w:p>
+        </w:tc>
+        <w:tc>
+          <w:tcPr>
+            <w:tcW w:type="dxa" w:w="5142"/>
+          </w:tcPr>
+          <w:p>
+            <w:pPr>
+              <w:pStyle w:val="IEEETableCell"/>
+            </w:pPr>
+            <w:r>
+              <w:t>0.9613</w:t>
+            </w:r>
+          </w:p>
+        </w:tc>
+      </w:tr>
+      <w:tr>
+        <w:tc>
+          <w:tcPr>
+            <w:tcW w:type="dxa" w:w="5142"/>
+          </w:tcPr>
+          <w:p>
+            <w:pPr>
+              <w:pStyle w:val="IEEETableCell"/>
+            </w:pPr>
+            <w:r>
+              <w:t>XGBoost + Local-Sum QNN</w:t>
+            </w:r>
+          </w:p>
+        </w:tc>
+        <w:tc>
+          <w:tcPr>
+            <w:tcW w:type="dxa" w:w="5142"/>
+          </w:tcPr>
+          <w:p>
+            <w:pPr>
+              <w:pStyle w:val="IEEETableCell"/>
+            </w:pPr>
+            <w:r>
+              <w:t>0.9665</w:t>
+            </w:r>
+          </w:p>
+        </w:tc>
+      </w:tr>
+      <w:tr>
+        <w:tc>
+          <w:tcPr>
+            <w:tcW w:type="dxa" w:w="5142"/>
+          </w:tcPr>
+          <w:p>
+            <w:pPr>
+              <w:pStyle w:val="IEEETableCell"/>
+            </w:pPr>
+            <w:r>
+              <w:t>XGBoost + matched classical control</w:t>
+            </w:r>
+          </w:p>
+        </w:tc>
+        <w:tc>
+          <w:tcPr>
+            <w:tcW w:type="dxa" w:w="5142"/>
+          </w:tcPr>
+          <w:p>
+            <w:pPr>
+              <w:pStyle w:val="IEEETableCell"/>
+            </w:pPr>
+            <w:r>
+              <w:t>0.9671</w:t>
+            </w:r>
+          </w:p>
+        </w:tc>
+      </w:tr>
+    </w:tbl>
+    <w:p>
+      <w:pPr>
+        <w:jc w:val="center"/>
+      </w:pPr>
+      <w:r>
+        <w:drawing>
+          <wp:inline xmlns:a="http://schemas.openxmlformats.org/drawingml/2006/main" xmlns:pic="http://schemas.openxmlformats.org/drawingml/2006/picture">
+            <wp:extent cx="2926080" cy="1921605"/>
+            <wp:docPr id="9" name="Picture 9"/>
+            <wp:cNvGraphicFramePr>
+              <a:graphicFrameLocks noChangeAspect="1"/>
+            </wp:cNvGraphicFramePr>
+            <a:graphic>
+              <a:graphicData uri="http://schemas.openxmlformats.org/drawingml/2006/picture">
+                <pic:pic>
+                  <pic:nvPicPr>
+                    <pic:cNvPr id="0" name="classical_capacity_control.png"/>
+                    <pic:cNvPicPr/>
+                  </pic:nvPicPr>
+                  <pic:blipFill>
+                    <a:blip r:embed="rId20"/>
+                    <a:stretch>
+                      <a:fillRect/>
+                    </a:stretch>
+                  </pic:blipFill>
+                  <pic:spPr>
+                    <a:xfrm>
+                      <a:off x="0" y="0"/>
+                      <a:ext cx="2926080" cy="1921605"/>
+                    </a:xfrm>
+                    <a:prstGeom prst="rect"/>
+                  </pic:spPr>
+                </pic:pic>
+              </a:graphicData>
+            </a:graphic>
+          </wp:inline>
+        </w:drawing>
+      </w:r>
+    </w:p>
+    <w:p>
+      <w:pPr>
+        <w:pStyle w:val="IEEEFigureCaptionMulti-Lines"/>
+      </w:pPr>
+      <w:r>
+        <w:t>Fig. 9. XGBoost alone vs. +Global-QNN vs. +Local-Sum-QNN vs. +matched classical control. The classical control's point estimate exceeds the quantum-augmented ensemble's; this figure establishes the boundary of the Local-Sum finding.</w:t>
+      </w:r>
+    </w:p>
+    <w:p>
+      <w:pPr>
+        <w:pStyle w:val="IEEEParagraph"/>
+      </w:pPr>
+      <w:r>
+        <w:t>The classical control's point estimate (0.9671) exceeds the quantum-augmented ensemble's (0.9665), and neither the quantum-augmented ensemble's improvement over XGBoost alone (95% bootstrap CI [-0.0035, +0.0173]) nor its comparison against the classical control excludes zero. Every other quantum architecture evaluated in this study -- QSVM, VQC, Chow-Liu-structured circuits, QBoost, five hybrid fusion architectures, and a quantum-kernel anomaly detector -- likewise failed to establish a statistically supported predictive advantage over its classical counterpart; the anomaly detector's promising small-scale result did not replicate at a larger, independent scale.</w:t>
+      </w:r>
+    </w:p>
+    <w:p>
+      <w:pPr>
+        <w:jc w:val="center"/>
+      </w:pPr>
+      <w:r>
+        <w:drawing>
+          <wp:inline xmlns:a="http://schemas.openxmlformats.org/drawingml/2006/main" xmlns:pic="http://schemas.openxmlformats.org/drawingml/2006/picture">
+            <wp:extent cx="2743200" cy="1550504"/>
+            <wp:docPr id="10" name="Picture 10"/>
+            <wp:cNvGraphicFramePr>
+              <a:graphicFrameLocks noChangeAspect="1"/>
+            </wp:cNvGraphicFramePr>
+            <a:graphic>
+              <a:graphicData uri="http://schemas.openxmlformats.org/drawingml/2006/picture">
+                <pic:pic>
+                  <pic:nvPicPr>
+                    <pic:cNvPr id="0" name="error_complementarity.png"/>
+                    <pic:cNvPicPr/>
+                  </pic:nvPicPr>
+                  <pic:blipFill>
+                    <a:blip r:embed="rId21"/>
+                    <a:stretch>
+                      <a:fillRect/>
+                    </a:stretch>
+                  </pic:blipFill>
+                  <pic:spPr>
+                    <a:xfrm>
+                      <a:off x="0" y="0"/>
+                      <a:ext cx="2743200" cy="1550504"/>
+                    </a:xfrm>
+                    <a:prstGeom prst="rect"/>
+                  </pic:spPr>
+                </pic:pic>
+              </a:graphicData>
+            </a:graphic>
+          </wp:inline>
+        </w:drawing>
+      </w:r>
+    </w:p>
+    <w:p>
+      <w:pPr>
+        <w:pStyle w:val="IEEEFigureCaptionMulti-Lines"/>
+      </w:pPr>
+      <w:r>
+        <w:t>Fig. 10. Classical x quantum error correlation across all 20 tested pairs -- every pair is positively correlated, providing no basis for a complementary-error ensemble benefit.</w:t>
+      </w:r>
+    </w:p>
+    <w:p>
+      <w:pPr>
+        <w:pStyle w:val="IEEEHeading1"/>
+      </w:pPr>
+      <w:r>
+        <w:t>Layer 2: Results</w:t>
+      </w:r>
+    </w:p>
+    <w:p>
+      <w:pPr>
+        <w:pStyle w:val="IEEEParagraph"/>
+      </w:pPr>
+      <w:r>
+        <w:t>Post-quantum key establishment follows the standard KEM interface:</w:t>
+      </w:r>
+    </w:p>
+    <w:p>
+      <w:pPr>
+        <w:pStyle w:val="IEEEParagraph"/>
+        <w:jc w:val="center"/>
+      </w:pPr>
+      <w:r>
+        <w:rPr>
+          <w:i/>
+        </w:rPr>
+        <w:t>(pk, sk) &lt;- KeyGen();   (c, K) &lt;- Encaps(pk);   K' &lt;- Decaps(sk, c);   K = K'</w:t>
+      </w:r>
+      <w:r>
+        <w:rPr>
+          <w:i w:val="0"/>
+        </w:rPr>
+        <w:tab/>
+        <w:t>(9)</w:t>
+      </w:r>
+    </w:p>
+    <w:p>
+      <w:pPr>
+        <w:pStyle w:val="IEEEParagraph"/>
+      </w:pPr>
+      <w:r>
+        <w:t>Digital signatures (classical and post-quantum) follow:</w:t>
+      </w:r>
+    </w:p>
+    <w:p>
+      <w:pPr>
+        <w:pStyle w:val="IEEEParagraph"/>
+        <w:jc w:val="center"/>
+      </w:pPr>
+      <w:r>
+        <w:rPr>
+          <w:i/>
+        </w:rPr>
+        <w:t>sigma &lt;- Sign(sk, m);   Verify(pk, m, sigma) in {true, false}</w:t>
+      </w:r>
+      <w:r>
+        <w:rPr>
+          <w:i w:val="0"/>
+        </w:rPr>
+        <w:tab/>
+        <w:t>(10)</w:t>
+      </w:r>
+    </w:p>
+    <w:p>
+      <w:pPr>
+        <w:pStyle w:val="IEEEParagraph"/>
+      </w:pPr>
+      <w:r>
+        <w:t>The hybrid key-derivation construction used for HYBRID_MAXIMUM/QKD_EXPERIMENTAL is:</w:t>
+      </w:r>
+    </w:p>
+    <w:p>
+      <w:pPr>
+        <w:pStyle w:val="IEEEParagraph"/>
+        <w:jc w:val="center"/>
+      </w:pPr>
+      <w:r>
+        <w:rPr>
+          <w:i/>
+        </w:rPr>
+        <w:t>K = HKDF-SHA256( ECDH_secret || ML-KEM_secret )</w:t>
+      </w:r>
+      <w:r>
+        <w:rPr>
+          <w:i w:val="0"/>
+        </w:rPr>
+        <w:tab/>
+        <w:t>(11)</w:t>
+      </w:r>
+    </w:p>
+    <w:p>
+      <w:pPr>
+        <w:jc w:val="center"/>
+      </w:pPr>
+      <w:r>
+        <w:drawing>
+          <wp:inline xmlns:a="http://schemas.openxmlformats.org/drawingml/2006/main" xmlns:pic="http://schemas.openxmlformats.org/drawingml/2006/picture">
+            <wp:extent cx="2377440" cy="14120155"/>
+            <wp:docPr id="11" name="Picture 11"/>
+            <wp:cNvGraphicFramePr>
+              <a:graphicFrameLocks noChangeAspect="1"/>
+            </wp:cNvGraphicFramePr>
+            <a:graphic>
+              <a:graphicData uri="http://schemas.openxmlformats.org/drawingml/2006/picture">
+                <pic:pic>
+                  <pic:nvPicPr>
+                    <pic:cNvPr id="0" name="layer2_crypto_workflow.png"/>
+                    <pic:cNvPicPr/>
+                  </pic:nvPicPr>
+                  <pic:blipFill>
+                    <a:blip r:embed="rId22"/>
+                    <a:stretch>
+                      <a:fillRect/>
+                    </a:stretch>
+                  </pic:blipFill>
+                  <pic:spPr>
+                    <a:xfrm>
+                      <a:off x="0" y="0"/>
+                      <a:ext cx="2377440" cy="14120155"/>
+                    </a:xfrm>
+                    <a:prstGeom prst="rect"/>
+                  </pic:spPr>
+                </pic:pic>
+              </a:graphicData>
+            </a:graphic>
+          </wp:inline>
+        </w:drawing>
+      </w:r>
+    </w:p>
+    <w:p>
+      <w:pPr>
+        <w:pStyle w:val="IEEEFigureCaptionMulti-Lines"/>
+      </w:pPr>
+      <w:r>
+        <w:t>Fig. 11. Layer 2 cryptographic protection workflow. ML-KEM establishes a key; AES-256-GCM always performs the bulk symmetric encryption of the payload.</w:t>
+      </w:r>
+    </w:p>
+    <w:p>
+      <w:pPr>
+        <w:pStyle w:val="IEEETableCaption"/>
+      </w:pPr>
+      <w:r>
+        <w:t>TABLE IV</w:t>
+      </w:r>
+    </w:p>
+    <w:p>
+      <w:pPr>
+        <w:pStyle w:val="IEEETableCaption"/>
+      </w:pPr>
+      <w:r>
+        <w:t>Signature Sizes by Algorithm (bytes)</w:t>
+      </w:r>
+    </w:p>
+    <w:tbl>
+      <w:tblPr>
+        <w:tblStyle w:val="TableGrid"/>
+        <w:tblW w:type="auto" w:w="0"/>
+        <w:tblLook w:firstColumn="1" w:firstRow="1" w:lastColumn="0" w:lastRow="0" w:noHBand="0" w:noVBand="1" w:val="04A0"/>
+      </w:tblPr>
+      <w:tblGrid>
+        <w:gridCol w:w="5142"/>
+        <w:gridCol w:w="5142"/>
+      </w:tblGrid>
+      <w:tr>
+        <w:tc>
+          <w:tcPr>
+            <w:tcW w:type="dxa" w:w="5142"/>
+          </w:tcPr>
+          <w:p>
+            <w:pPr>
+              <w:pStyle w:val="IEEETableHeaderCentered"/>
+            </w:pPr>
+            <w:r>
+              <w:t>Algorithm</w:t>
+            </w:r>
+          </w:p>
+        </w:tc>
+        <w:tc>
+          <w:tcPr>
+            <w:tcW w:type="dxa" w:w="5142"/>
+          </w:tcPr>
+          <w:p>
+            <w:pPr>
+              <w:pStyle w:val="IEEETableHeaderCentered"/>
+            </w:pPr>
+            <w:r>
+              <w:t>Size (bytes)</w:t>
+            </w:r>
+          </w:p>
+        </w:tc>
+      </w:tr>
+      <w:tr>
+        <w:tc>
+          <w:tcPr>
+            <w:tcW w:type="dxa" w:w="5142"/>
+          </w:tcPr>
+          <w:p>
+            <w:pPr>
+              <w:pStyle w:val="IEEETableCell"/>
+            </w:pPr>
+            <w:r>
+              <w:t>RSA-3072-PSS</w:t>
+            </w:r>
+          </w:p>
+        </w:tc>
+        <w:tc>
+          <w:tcPr>
+            <w:tcW w:type="dxa" w:w="5142"/>
+          </w:tcPr>
+          <w:p>
+            <w:pPr>
+              <w:pStyle w:val="IEEETableCell"/>
+            </w:pPr>
+            <w:r>
+              <w:t>384</w:t>
+            </w:r>
+          </w:p>
+        </w:tc>
+      </w:tr>
+      <w:tr>
+        <w:tc>
+          <w:tcPr>
+            <w:tcW w:type="dxa" w:w="5142"/>
+          </w:tcPr>
+          <w:p>
+            <w:pPr>
+              <w:pStyle w:val="IEEETableCell"/>
+            </w:pPr>
+            <w:r>
+              <w:t>ECDSA-P256</w:t>
+            </w:r>
+          </w:p>
+        </w:tc>
+        <w:tc>
+          <w:tcPr>
+            <w:tcW w:type="dxa" w:w="5142"/>
+          </w:tcPr>
+          <w:p>
+            <w:pPr>
+              <w:pStyle w:val="IEEETableCell"/>
+            </w:pPr>
+            <w:r>
+              <w:t>70</w:t>
+            </w:r>
+          </w:p>
+        </w:tc>
+      </w:tr>
+      <w:tr>
+        <w:tc>
+          <w:tcPr>
+            <w:tcW w:type="dxa" w:w="5142"/>
+          </w:tcPr>
+          <w:p>
+            <w:pPr>
+              <w:pStyle w:val="IEEETableCell"/>
+            </w:pPr>
+            <w:r>
+              <w:t>ML-DSA-65</w:t>
+            </w:r>
+          </w:p>
+        </w:tc>
+        <w:tc>
+          <w:tcPr>
+            <w:tcW w:type="dxa" w:w="5142"/>
+          </w:tcPr>
+          <w:p>
+            <w:pPr>
+              <w:pStyle w:val="IEEETableCell"/>
+            </w:pPr>
+            <w:r>
+              <w:t>3309</w:t>
+            </w:r>
+          </w:p>
+        </w:tc>
+      </w:tr>
+      <w:tr>
+        <w:tc>
+          <w:tcPr>
+            <w:tcW w:type="dxa" w:w="5142"/>
+          </w:tcPr>
+          <w:p>
+            <w:pPr>
+              <w:pStyle w:val="IEEETableCell"/>
+            </w:pPr>
+            <w:r>
+              <w:t>SLH-DSA-SHA2-128s</w:t>
+            </w:r>
+          </w:p>
+        </w:tc>
+        <w:tc>
+          <w:tcPr>
+            <w:tcW w:type="dxa" w:w="5142"/>
+          </w:tcPr>
+          <w:p>
+            <w:pPr>
+              <w:pStyle w:val="IEEETableCell"/>
+            </w:pPr>
+            <w:r>
+              <w:t>7856</w:t>
+            </w:r>
+          </w:p>
+        </w:tc>
+      </w:tr>
+    </w:tbl>
+    <w:p>
+      <w:pPr>
+        <w:jc w:val="center"/>
+      </w:pPr>
+      <w:r>
+        <w:drawing>
+          <wp:inline xmlns:a="http://schemas.openxmlformats.org/drawingml/2006/main" xmlns:pic="http://schemas.openxmlformats.org/drawingml/2006/picture">
+            <wp:extent cx="2743200" cy="1749287"/>
+            <wp:docPr id="12" name="Picture 12"/>
+            <wp:cNvGraphicFramePr>
+              <a:graphicFrameLocks noChangeAspect="1"/>
+            </wp:cNvGraphicFramePr>
+            <a:graphic>
+              <a:graphicData uri="http://schemas.openxmlformats.org/drawingml/2006/picture">
+                <pic:pic>
+                  <pic:nvPicPr>
+                    <pic:cNvPr id="0" name="signature_sizes.png"/>
+                    <pic:cNvPicPr/>
+                  </pic:nvPicPr>
+                  <pic:blipFill>
+                    <a:blip r:embed="rId23"/>
+                    <a:stretch>
+                      <a:fillRect/>
+                    </a:stretch>
+                  </pic:blipFill>
+                  <pic:spPr>
+                    <a:xfrm>
+                      <a:off x="0" y="0"/>
+                      <a:ext cx="2743200" cy="1749287"/>
+                    </a:xfrm>
+                    <a:prstGeom prst="rect"/>
+                  </pic:spPr>
+                </pic:pic>
+              </a:graphicData>
+            </a:graphic>
+          </wp:inline>
+        </w:drawing>
+      </w:r>
+    </w:p>
+    <w:p>
+      <w:pPr>
+        <w:pStyle w:val="IEEEFigureCaptionMulti-Lines"/>
+      </w:pPr>
+      <w:r>
+        <w:t>Fig. 12. Classical vs. post-quantum signature sizes (log scale). ML-DSA-65 is approximately 47x ECDSA's size; SLH-DSA-SHA2-128s is approximately 112x.</w:t>
+      </w:r>
+    </w:p>
+    <w:p>
+      <w:pPr>
+        <w:jc w:val="center"/>
+      </w:pPr>
+      <w:r>
+        <w:drawing>
+          <wp:inline xmlns:a="http://schemas.openxmlformats.org/drawingml/2006/main" xmlns:pic="http://schemas.openxmlformats.org/drawingml/2006/picture">
+            <wp:extent cx="3017520" cy="1218081"/>
+            <wp:docPr id="13" name="Picture 13"/>
+            <wp:cNvGraphicFramePr>
+              <a:graphicFrameLocks noChangeAspect="1"/>
+            </wp:cNvGraphicFramePr>
+            <a:graphic>
+              <a:graphicData uri="http://schemas.openxmlformats.org/drawingml/2006/picture">
+                <pic:pic>
+                  <pic:nvPicPr>
+                    <pic:cNvPr id="0" name="sign_verify_latency.png"/>
+                    <pic:cNvPicPr/>
+                  </pic:nvPicPr>
+                  <pic:blipFill>
+                    <a:blip r:embed="rId24"/>
+                    <a:stretch>
+                      <a:fillRect/>
+                    </a:stretch>
+                  </pic:blipFill>
+                  <pic:spPr>
+                    <a:xfrm>
+                      <a:off x="0" y="0"/>
+                      <a:ext cx="3017520" cy="1218081"/>
+                    </a:xfrm>
+                    <a:prstGeom prst="rect"/>
+                  </pic:spPr>
+                </pic:pic>
+              </a:graphicData>
+            </a:graphic>
+          </wp:inline>
+        </w:drawing>
+      </w:r>
+    </w:p>
+    <w:p>
+      <w:pPr>
+        <w:pStyle w:val="IEEEFigureCaptionMulti-Lines"/>
+      </w:pPr>
+      <w:r>
+        <w:t>Fig. 13. Sign (left) and verify (right) latency by algorithm, log scale. The large SLH-DSA latency is left visible rather than compressed by axis scaling.</w:t>
+      </w:r>
+    </w:p>
+    <w:p>
+      <w:pPr>
+        <w:pStyle w:val="IEEEParagraph"/>
+      </w:pPr>
+      <w:r>
+        <w:t>ML-DSA-65 signing exhibited a genuinely large runtime variance (86 to 1494 milliseconds across 30 repetitions), attributable to the scheme's Fiat-Shamir-with-aborts rejection sampling rather than measurement noise. SLH-DSA signing required approximately 15 seconds per call in this pure-Python implementation, making the evaluated configuration unsuitable for this study's real-time transaction path; this is a property of this specific implementation and parameter set, not a general claim about SLH-DSA or about optimized native implementations.</w:t>
+      </w:r>
+    </w:p>
+    <w:p>
+      <w:pPr>
+        <w:jc w:val="center"/>
+      </w:pPr>
+      <w:r>
+        <w:drawing>
+          <wp:inline xmlns:a="http://schemas.openxmlformats.org/drawingml/2006/main" xmlns:pic="http://schemas.openxmlformats.org/drawingml/2006/picture">
+            <wp:extent cx="2560320" cy="1866258"/>
+            <wp:docPr id="14" name="Picture 14"/>
+            <wp:cNvGraphicFramePr>
+              <a:graphicFrameLocks noChangeAspect="1"/>
+            </wp:cNvGraphicFramePr>
+            <a:graphic>
+              <a:graphicData uri="http://schemas.openxmlformats.org/drawingml/2006/picture">
+                <pic:pic>
+                  <pic:nvPicPr>
+                    <pic:cNvPr id="0" name="profile_latency.png"/>
+                    <pic:cNvPicPr/>
+                  </pic:nvPicPr>
+                  <pic:blipFill>
+                    <a:blip r:embed="rId25"/>
+                    <a:stretch>
+                      <a:fillRect/>
+                    </a:stretch>
+                  </pic:blipFill>
+                  <pic:spPr>
+                    <a:xfrm>
+                      <a:off x="0" y="0"/>
+                      <a:ext cx="2560320" cy="1866258"/>
+                    </a:xfrm>
+                    <a:prstGeom prst="rect"/>
+                  </pic:spPr>
+                </pic:pic>
+              </a:graphicData>
+            </a:graphic>
+          </wp:inline>
+        </w:drawing>
+      </w:r>
+    </w:p>
+    <w:p>
+      <w:pPr>
+        <w:pStyle w:val="IEEEFigureCaptionMulti-Lines"/>
+      </w:pPr>
+      <w:r>
+        <w:t>Fig. 14. Real measured end-to-end latency by security profile. HYBRID_MAXIMUM/QKD_EXPERIMENTAL cost is dominated by SLH-DSA signing.</w:t>
+      </w:r>
+    </w:p>
+    <w:p>
+      <w:pPr>
+        <w:pStyle w:val="IEEEHeading2"/>
+      </w:pPr>
+      <w:r>
+        <w:t>BB84 Quantum Key Distribution Simulation</w:t>
+      </w:r>
+    </w:p>
+    <w:p>
+      <w:pPr>
+        <w:pStyle w:val="IEEEParagraph"/>
+        <w:jc w:val="center"/>
+      </w:pPr>
+      <w:r>
+        <w:rPr>
+          <w:i/>
+        </w:rPr>
+        <w:t>|0&gt;, |1&gt;  (computational basis)</w:t>
+      </w:r>
+      <w:r>
+        <w:rPr>
+          <w:i w:val="0"/>
+        </w:rPr>
+        <w:tab/>
+        <w:t>(12)</w:t>
+      </w:r>
+    </w:p>
+    <w:p>
+      <w:pPr>
+        <w:pStyle w:val="IEEEParagraph"/>
+        <w:jc w:val="center"/>
+      </w:pPr>
+      <w:r>
+        <w:rPr>
+          <w:i/>
+        </w:rPr>
+        <w:t>|+&gt; = (|0&gt; + |1&gt;) / sqrt(2),   |-&gt; = (|0&gt; - |1&gt;) / sqrt(2)  (Hadamard basis)</w:t>
+      </w:r>
+      <w:r>
+        <w:rPr>
+          <w:i w:val="0"/>
+        </w:rPr>
+        <w:tab/>
+        <w:t>(13)</w:t>
+      </w:r>
+    </w:p>
+    <w:p>
+      <w:pPr>
+        <w:pStyle w:val="IEEEParagraph"/>
+        <w:jc w:val="center"/>
+      </w:pPr>
+      <w:r>
+        <w:rPr>
+          <w:i/>
+        </w:rPr>
+        <w:t>QBER = N_error / N_sifted</w:t>
+      </w:r>
+      <w:r>
+        <w:rPr>
+          <w:i w:val="0"/>
+        </w:rPr>
+        <w:tab/>
+        <w:t>(14)</w:t>
+      </w:r>
+    </w:p>
+    <w:p>
+      <w:pPr>
+        <w:jc w:val="center"/>
+      </w:pPr>
+      <w:r>
+        <w:drawing>
+          <wp:inline xmlns:a="http://schemas.openxmlformats.org/drawingml/2006/main" xmlns:pic="http://schemas.openxmlformats.org/drawingml/2006/picture">
+            <wp:extent cx="2011680" cy="10860677"/>
+            <wp:docPr id="15" name="Picture 15"/>
+            <wp:cNvGraphicFramePr>
+              <a:graphicFrameLocks noChangeAspect="1"/>
+            </wp:cNvGraphicFramePr>
+            <a:graphic>
+              <a:graphicData uri="http://schemas.openxmlformats.org/drawingml/2006/picture">
+                <pic:pic>
+                  <pic:nvPicPr>
+                    <pic:cNvPr id="0" name="bb84_protocol_diagram.png"/>
+                    <pic:cNvPicPr/>
+                  </pic:nvPicPr>
+                  <pic:blipFill>
+                    <a:blip r:embed="rId26"/>
+                    <a:stretch>
+                      <a:fillRect/>
+                    </a:stretch>
+                  </pic:blipFill>
+                  <pic:spPr>
+                    <a:xfrm>
+                      <a:off x="0" y="0"/>
+                      <a:ext cx="2011680" cy="10860677"/>
+                    </a:xfrm>
+                    <a:prstGeom prst="rect"/>
+                  </pic:spPr>
+                </pic:pic>
+              </a:graphicData>
+            </a:graphic>
+          </wp:inline>
+        </w:drawing>
+      </w:r>
+    </w:p>
+    <w:p>
+      <w:pPr>
+        <w:pStyle w:val="IEEEFigureCaptionMulti-Lines"/>
+      </w:pPr>
+      <w:r>
+        <w:t>Fig. 15. BB84 protocol as simulated in this study -- a classical software simulation of the protocol's information-theoretic structure, not a physical quantum channel.</w:t>
+      </w:r>
+    </w:p>
+    <w:p>
+      <w:pPr>
+        <w:jc w:val="center"/>
+      </w:pPr>
+      <w:r>
+        <w:drawing>
+          <wp:inline xmlns:a="http://schemas.openxmlformats.org/drawingml/2006/main" xmlns:pic="http://schemas.openxmlformats.org/drawingml/2006/picture">
+            <wp:extent cx="2926080" cy="2109746"/>
+            <wp:docPr id="16" name="Picture 16"/>
+            <wp:cNvGraphicFramePr>
+              <a:graphicFrameLocks noChangeAspect="1"/>
+            </wp:cNvGraphicFramePr>
+            <a:graphic>
+              <a:graphicData uri="http://schemas.openxmlformats.org/drawingml/2006/picture">
+                <pic:pic>
+                  <pic:nvPicPr>
+                    <pic:cNvPr id="0" name="bb84_intercept_resend_diagram.png"/>
+                    <pic:cNvPicPr/>
+                  </pic:nvPicPr>
+                  <pic:blipFill>
+                    <a:blip r:embed="rId27"/>
+                    <a:stretch>
+                      <a:fillRect/>
+                    </a:stretch>
+                  </pic:blipFill>
+                  <pic:spPr>
+                    <a:xfrm>
+                      <a:off x="0" y="0"/>
+                      <a:ext cx="2926080" cy="2109746"/>
+                    </a:xfrm>
+                    <a:prstGeom prst="rect"/>
+                  </pic:spPr>
+                </pic:pic>
+              </a:graphicData>
+            </a:graphic>
+          </wp:inline>
+        </w:drawing>
+      </w:r>
+    </w:p>
+    <w:p>
+      <w:pPr>
+        <w:pStyle w:val="IEEEFigureCaptionMulti-Lines"/>
+      </w:pPr>
+      <w:r>
+        <w:t>Fig. 16. Intercept-resend eavesdropping: when Eve's basis does not match Alice's, her measurement and resend is uniformly random, introducing a detectable bit error with probability approximately 25%.</w:t>
+      </w:r>
+    </w:p>
+    <w:p>
+      <w:pPr>
+        <w:pStyle w:val="IEEETableCaption"/>
+      </w:pPr>
+      <w:r>
+        <w:t>TABLE V</w:t>
       </w:r>
     </w:p>
     <w:p>
@@ -802,7 +2218,9 @@
             <w:pPr>
               <w:pStyle w:val="IEEETableHeaderCentered"/>
             </w:pPr>
-            <w:r/>
+            <w:r>
+              <w:t>key_acceptance_rate</w:t>
+            </w:r>
           </w:p>
         </w:tc>
       </w:tr>
@@ -841,7 +2259,9 @@
             <w:pPr>
               <w:pStyle w:val="IEEETableCell"/>
             </w:pPr>
-            <w:r/>
+            <w:r>
+              <w:t>1.0</w:t>
+            </w:r>
           </w:p>
         </w:tc>
       </w:tr>
@@ -880,7 +2300,9 @@
             <w:pPr>
               <w:pStyle w:val="IEEETableCell"/>
             </w:pPr>
-            <w:r/>
+            <w:r>
+              <w:t>1.0</w:t>
+            </w:r>
           </w:p>
         </w:tc>
       </w:tr>
@@ -919,7 +2341,9 @@
             <w:pPr>
               <w:pStyle w:val="IEEETableCell"/>
             </w:pPr>
-            <w:r/>
+            <w:r>
+              <w:t>1.0</w:t>
+            </w:r>
           </w:p>
         </w:tc>
       </w:tr>
@@ -958,7 +2382,9 @@
             <w:pPr>
               <w:pStyle w:val="IEEETableCell"/>
             </w:pPr>
-            <w:r/>
+            <w:r>
+              <w:t>0.8</w:t>
+            </w:r>
           </w:p>
         </w:tc>
       </w:tr>
@@ -997,7 +2423,9 @@
             <w:pPr>
               <w:pStyle w:val="IEEETableCell"/>
             </w:pPr>
-            <w:r/>
+            <w:r>
+              <w:t>0.0</w:t>
+            </w:r>
           </w:p>
         </w:tc>
       </w:tr>
@@ -1036,25 +2464,332 @@
             <w:pPr>
               <w:pStyle w:val="IEEETableCell"/>
             </w:pPr>
-            <w:r/>
+            <w:r>
+              <w:t>0.0</w:t>
+            </w:r>
           </w:p>
         </w:tc>
       </w:tr>
     </w:tbl>
     <w:p>
       <w:pPr>
+        <w:jc w:val="center"/>
+      </w:pPr>
+      <w:r>
+        <w:drawing>
+          <wp:inline xmlns:a="http://schemas.openxmlformats.org/drawingml/2006/main" xmlns:pic="http://schemas.openxmlformats.org/drawingml/2006/picture">
+            <wp:extent cx="3017520" cy="1218081"/>
+            <wp:docPr id="17" name="Picture 17"/>
+            <wp:cNvGraphicFramePr>
+              <a:graphicFrameLocks noChangeAspect="1"/>
+            </wp:cNvGraphicFramePr>
+            <a:graphic>
+              <a:graphicData uri="http://schemas.openxmlformats.org/drawingml/2006/picture">
+                <pic:pic>
+                  <pic:nvPicPr>
+                    <pic:cNvPr id="0" name="bb84_qber.png"/>
+                    <pic:cNvPicPr/>
+                  </pic:nvPicPr>
+                  <pic:blipFill>
+                    <a:blip r:embed="rId28"/>
+                    <a:stretch>
+                      <a:fillRect/>
+                    </a:stretch>
+                  </pic:blipFill>
+                  <pic:spPr>
+                    <a:xfrm>
+                      <a:off x="0" y="0"/>
+                      <a:ext cx="3017520" cy="1218081"/>
+                    </a:xfrm>
+                    <a:prstGeom prst="rect"/>
+                  </pic:spPr>
+                </pic:pic>
+              </a:graphicData>
+            </a:graphic>
+          </wp:inline>
+        </w:drawing>
+      </w:r>
+    </w:p>
+    <w:p>
+      <w:pPr>
+        <w:pStyle w:val="IEEEFigureCaptionMulti-Lines"/>
+      </w:pPr>
+      <w:r>
+        <w:t>Fig. 17. Measured QBER vs. injected channel noise (left) and Eve detection (right), 30 trials per condition. QBER tracks injected noise closely; the intercept-resend eavesdropper was detected in all 30 trials at the stated 11% threshold.</w:t>
+      </w:r>
+    </w:p>
+    <w:p>
+      <w:pPr>
         <w:pStyle w:val="IEEEParagraph"/>
       </w:pPr>
       <w:r>
-        <w:t>Measured quantum bit error rate tracked injected channel noise closely across all tested conditions, and an intercept-resend eavesdropper was correctly detected in all 30 trials at the standard 11% acceptance threshold, with measured error rates near the textbook-predicted 25% for this attack. This is a software simulation of BB84's information-theoretic structure; it constitutes no claim of physical quantum-key-distribution security.</w:t>
-      </w:r>
-    </w:p>
-    <w:p>
-      <w:pPr>
-        <w:pStyle w:val="IEEEHeading1"/>
-      </w:pPr>
-      <w:r>
-        <w:t>Layer 1-to-Layer 2 Integration</w:t>
+        <w:t>Measured quantum bit error rate tracked injected channel noise closely across all tested conditions (1% noise -&gt; 0.89% measured QBER; 5% -&gt; 4.79%; 10% -&gt; 9.47%), and an intercept-resend eavesdropper was detected in all 30 trials at the standard 11% acceptance threshold, with measured error rates near the textbook-predicted 25% for this attack. This result is valid under exactly these 30-trial, 2000-bit conditions and is not generalized to a universal eavesdropper-detection guarantee.</w:t>
+      </w:r>
+    </w:p>
+    <w:p>
+      <w:pPr>
+        <w:pStyle w:val="IEEEHeading2"/>
+      </w:pPr>
+      <w:r>
+        <w:t>Implementation Backend as a Source of PQC Performance Variation</w:t>
+      </w:r>
+    </w:p>
+    <w:p>
+      <w:pPr>
+        <w:pStyle w:val="IEEEParagraph"/>
+      </w:pPr>
+      <w:r>
+        <w:t>The pure-Python PQC latencies above, especially SLH-DSA's, are poor proxies for an optimized native implementation's cost. To quantify this, a native PQC backend (`liboqs-python`, wrapping the native `liboqs` C library) was attempted as a bounded follow-up experiment. The Python package installed successfully, but importing it triggers an automatic native-library build via CMake, which failed immediately because this Windows development environment has no CMake or MSVC C/C++ toolchain on its PATH and no unattended toolchain installation route was available. Per the pre-specified fallback rule for this experiment, no substitute cryptographic package was installed merely for having a similarly named algorithm. Result: native PQC backend unavailable in the current environment. Consequently, no reference-vs-native benchmark could be produced, and the SLH-DSA signing time reported above should be read strictly as a reference-Python-implementation cost -- not as a general statement about SLH-DSA's practicality on optimized native code. This attempt, and its outcome, are reported rather than omitted, since honestly measuring an implementation limitation is itself part of this study's contribution.</w:t>
+      </w:r>
+    </w:p>
+    <w:p>
+      <w:pPr>
+        <w:pStyle w:val="IEEEHeading2"/>
+      </w:pPr>
+      <w:r>
+        <w:t>Qiskit Circuit-Level BB84 Cross-Validation</w:t>
+      </w:r>
+    </w:p>
+    <w:p>
+      <w:pPr>
+        <w:pStyle w:val="IEEEParagraph"/>
+      </w:pPr>
+      <w:r>
+        <w:t>The BB84 simulation above operates at the protocol level, sampling sifting and error outcomes from modeled probabilities. As an independent cross-validation, a second, circuit-level BB84 implementation was built using Qiskit and Qiskit Aer (qiskit 2.5.2, qiskit-aer 0.17.2), which prepares and measures explicit single-qubit states rather than sampling protocol-level probabilities directly.</w:t>
+      </w:r>
+    </w:p>
+    <w:p>
+      <w:pPr>
+        <w:pStyle w:val="IEEEParagraph"/>
+        <w:jc w:val="center"/>
+      </w:pPr>
+      <w:r>
+        <w:rPr>
+          <w:i/>
+        </w:rPr>
+        <w:t>bit=0,Z -&gt; |0&gt;  (I);   bit=1,Z -&gt; |1&gt;  (X)</w:t>
+      </w:r>
+      <w:r>
+        <w:rPr>
+          <w:i w:val="0"/>
+        </w:rPr>
+        <w:tab/>
+        <w:t>(18)</w:t>
+      </w:r>
+    </w:p>
+    <w:p>
+      <w:pPr>
+        <w:pStyle w:val="IEEEParagraph"/>
+        <w:jc w:val="center"/>
+      </w:pPr>
+      <w:r>
+        <w:rPr>
+          <w:i/>
+        </w:rPr>
+        <w:t>bit=0,X -&gt; |+&gt;  (H);   bit=1,X -&gt; |-&gt;  (X then H)</w:t>
+      </w:r>
+      <w:r>
+        <w:rPr>
+          <w:i w:val="0"/>
+        </w:rPr>
+        <w:tab/>
+        <w:t>(19)</w:t>
+      </w:r>
+    </w:p>
+    <w:p>
+      <w:pPr>
+        <w:jc w:val="center"/>
+      </w:pPr>
+      <w:r>
+        <w:drawing>
+          <wp:inline xmlns:a="http://schemas.openxmlformats.org/drawingml/2006/main" xmlns:pic="http://schemas.openxmlformats.org/drawingml/2006/picture">
+            <wp:extent cx="2377440" cy="806295"/>
+            <wp:docPr id="18" name="Picture 18"/>
+            <wp:cNvGraphicFramePr>
+              <a:graphicFrameLocks noChangeAspect="1"/>
+            </wp:cNvGraphicFramePr>
+            <a:graphic>
+              <a:graphicData uri="http://schemas.openxmlformats.org/drawingml/2006/picture">
+                <pic:pic>
+                  <pic:nvPicPr>
+                    <pic:cNvPr id="0" name="bb84_circuit_full_representative.png"/>
+                    <pic:cNvPicPr/>
+                  </pic:nvPicPr>
+                  <pic:blipFill>
+                    <a:blip r:embed="rId29"/>
+                    <a:stretch>
+                      <a:fillRect/>
+                    </a:stretch>
+                  </pic:blipFill>
+                  <pic:spPr>
+                    <a:xfrm>
+                      <a:off x="0" y="0"/>
+                      <a:ext cx="2377440" cy="806295"/>
+                    </a:xfrm>
+                    <a:prstGeom prst="rect"/>
+                  </pic:spPr>
+                </pic:pic>
+              </a:graphicData>
+            </a:graphic>
+          </wp:inline>
+        </w:drawing>
+      </w:r>
+    </w:p>
+    <w:p>
+      <w:pPr>
+        <w:pStyle w:val="IEEEFigureCaptionMulti-Lines"/>
+      </w:pPr>
+      <w:r>
+        <w:t>Fig. 18. Representative Alice-to-Bob BB84 circuit (bit=1, Z basis, matching bases): state preparation followed by Bob's computational-basis measurement.</w:t>
+      </w:r>
+    </w:p>
+    <w:p>
+      <w:pPr>
+        <w:jc w:val="center"/>
+      </w:pPr>
+      <w:r>
+        <w:drawing>
+          <wp:inline xmlns:a="http://schemas.openxmlformats.org/drawingml/2006/main" xmlns:pic="http://schemas.openxmlformats.org/drawingml/2006/picture">
+            <wp:extent cx="2377440" cy="769701"/>
+            <wp:docPr id="19" name="Picture 19"/>
+            <wp:cNvGraphicFramePr>
+              <a:graphicFrameLocks noChangeAspect="1"/>
+            </wp:cNvGraphicFramePr>
+            <a:graphic>
+              <a:graphicData uri="http://schemas.openxmlformats.org/drawingml/2006/picture">
+                <pic:pic>
+                  <pic:nvPicPr>
+                    <pic:cNvPr id="0" name="bb84_circuit_eve_intercept_representative.png"/>
+                    <pic:cNvPicPr/>
+                  </pic:nvPicPr>
+                  <pic:blipFill>
+                    <a:blip r:embed="rId30"/>
+                    <a:stretch>
+                      <a:fillRect/>
+                    </a:stretch>
+                  </pic:blipFill>
+                  <pic:spPr>
+                    <a:xfrm>
+                      <a:off x="0" y="0"/>
+                      <a:ext cx="2377440" cy="769701"/>
+                    </a:xfrm>
+                    <a:prstGeom prst="rect"/>
+                  </pic:spPr>
+                </pic:pic>
+              </a:graphicData>
+            </a:graphic>
+          </wp:inline>
+        </w:drawing>
+      </w:r>
+    </w:p>
+    <w:p>
+      <w:pPr>
+        <w:pStyle w:val="IEEEFigureCaptionMulti-Lines"/>
+      </w:pPr>
+      <w:r>
+        <w:t>Fig. 19. Representative intercept-resend circuit: Eve measures Alice's Z-basis |1&gt; state in the wrong (X) basis before resending, the mechanism by which an eavesdropper introduces detectable error.</w:t>
+      </w:r>
+    </w:p>
+    <w:p>
+      <w:pPr>
+        <w:jc w:val="center"/>
+      </w:pPr>
+      <w:r>
+        <w:drawing>
+          <wp:inline xmlns:a="http://schemas.openxmlformats.org/drawingml/2006/main" xmlns:pic="http://schemas.openxmlformats.org/drawingml/2006/picture">
+            <wp:extent cx="1828800" cy="2217420"/>
+            <wp:docPr id="20" name="Picture 20"/>
+            <wp:cNvGraphicFramePr>
+              <a:graphicFrameLocks noChangeAspect="1"/>
+            </wp:cNvGraphicFramePr>
+            <a:graphic>
+              <a:graphicData uri="http://schemas.openxmlformats.org/drawingml/2006/picture">
+                <pic:pic>
+                  <pic:nvPicPr>
+                    <pic:cNvPr id="0" name="bb84_circuit_alice_z0.png"/>
+                    <pic:cNvPicPr/>
+                  </pic:nvPicPr>
+                  <pic:blipFill>
+                    <a:blip r:embed="rId31"/>
+                    <a:stretch>
+                      <a:fillRect/>
+                    </a:stretch>
+                  </pic:blipFill>
+                  <pic:spPr>
+                    <a:xfrm>
+                      <a:off x="0" y="0"/>
+                      <a:ext cx="1828800" cy="2217420"/>
+                    </a:xfrm>
+                    <a:prstGeom prst="rect"/>
+                  </pic:spPr>
+                </pic:pic>
+              </a:graphicData>
+            </a:graphic>
+          </wp:inline>
+        </w:drawing>
+      </w:r>
+    </w:p>
+    <w:p>
+      <w:pPr>
+        <w:pStyle w:val="IEEEFigureCaptionMulti-Lines"/>
+      </w:pPr>
+      <w:r>
+        <w:t>Fig. 20. Alice state preparation, Z basis, bit=0 (|0&gt;, identity).</w:t>
+      </w:r>
+    </w:p>
+    <w:p>
+      <w:pPr>
+        <w:jc w:val="center"/>
+      </w:pPr>
+      <w:r>
+        <w:drawing>
+          <wp:inline xmlns:a="http://schemas.openxmlformats.org/drawingml/2006/main" xmlns:pic="http://schemas.openxmlformats.org/drawingml/2006/picture">
+            <wp:extent cx="1828800" cy="1565238"/>
+            <wp:docPr id="21" name="Picture 21"/>
+            <wp:cNvGraphicFramePr>
+              <a:graphicFrameLocks noChangeAspect="1"/>
+            </wp:cNvGraphicFramePr>
+            <a:graphic>
+              <a:graphicData uri="http://schemas.openxmlformats.org/drawingml/2006/picture">
+                <pic:pic>
+                  <pic:nvPicPr>
+                    <pic:cNvPr id="0" name="bb84_circuit_alice_xminus.png"/>
+                    <pic:cNvPicPr/>
+                  </pic:nvPicPr>
+                  <pic:blipFill>
+                    <a:blip r:embed="rId32"/>
+                    <a:stretch>
+                      <a:fillRect/>
+                    </a:stretch>
+                  </pic:blipFill>
+                  <pic:spPr>
+                    <a:xfrm>
+                      <a:off x="0" y="0"/>
+                      <a:ext cx="1828800" cy="1565238"/>
+                    </a:xfrm>
+                    <a:prstGeom prst="rect"/>
+                  </pic:spPr>
+                </pic:pic>
+              </a:graphicData>
+            </a:graphic>
+          </wp:inline>
+        </w:drawing>
+      </w:r>
+    </w:p>
+    <w:p>
+      <w:pPr>
+        <w:pStyle w:val="IEEEFigureCaptionMulti-Lines"/>
+      </w:pPr>
+      <w:r>
+        <w:t>Fig. 21. Alice state preparation, X basis, bit=1 (|-&gt;, X then H).</w:t>
+      </w:r>
+    </w:p>
+    <w:p>
+      <w:pPr>
+        <w:pStyle w:val="IEEEParagraph"/>
+      </w:pPr>
+      <w:r>
+        <w:t>The circuit implementation was run under the same six conditions as the protocol-level simulator (30 trials per condition), at a reduced raw-bit count per trial (200 vs. 2000) to bound per-qubit circuit-simulation overhead -- a disclosed reduction, not a hidden one.</w:t>
       </w:r>
     </w:p>
     <w:p>
@@ -1062,7 +2797,7 @@
         <w:pStyle w:val="IEEETableCaption"/>
       </w:pPr>
       <w:r>
-        <w:t>TABLE IV</w:t>
+        <w:t>TABLE VI</w:t>
       </w:r>
     </w:p>
     <w:p>
@@ -1070,7 +2805,7 @@
         <w:pStyle w:val="IEEETableCaption"/>
       </w:pPr>
       <w:r>
-        <w:t>Routing Policy Ablation (Production Test Fold, n=55,133)</w:t>
+        <w:t>Cross-Implementation Validation: Protocol Simulator vs. Qiskit Circuits</w:t>
       </w:r>
     </w:p>
     <w:tbl>
@@ -1095,7 +2830,7 @@
               <w:pStyle w:val="IEEETableHeaderCentered"/>
             </w:pPr>
             <w:r>
-              <w:t>policy</w:t>
+              <w:t>Condition</w:t>
             </w:r>
           </w:p>
         </w:tc>
@@ -1108,7 +2843,7 @@
               <w:pStyle w:val="IEEETableHeaderCentered"/>
             </w:pPr>
             <w:r>
-              <w:t>security_escalation_rate</w:t>
+              <w:t>Protocol-sim mean QBER</w:t>
             </w:r>
           </w:p>
         </w:tc>
@@ -1121,7 +2856,7 @@
               <w:pStyle w:val="IEEETableHeaderCentered"/>
             </w:pPr>
             <w:r>
-              <w:t>fraud_weighted_coverage</w:t>
+              <w:t>Qiskit mean QBER</w:t>
             </w:r>
           </w:p>
         </w:tc>
@@ -1134,7 +2869,7 @@
               <w:pStyle w:val="IEEETableHeaderCentered"/>
             </w:pPr>
             <w:r>
-              <w:t>benign_escalation_rate</w:t>
+              <w:t>Abs. diff</w:t>
             </w:r>
           </w:p>
         </w:tc>
@@ -1149,7 +2884,7 @@
               <w:pStyle w:val="IEEETableCell"/>
             </w:pPr>
             <w:r>
-              <w:t>A_categorical</w:t>
+              <w:t>Clean channel</w:t>
             </w:r>
           </w:p>
         </w:tc>
@@ -1162,7 +2897,7 @@
               <w:pStyle w:val="IEEETableCell"/>
             </w:pPr>
             <w:r>
-              <w:t>0.0011</w:t>
+              <w:t>0.0000</w:t>
             </w:r>
           </w:p>
         </w:tc>
@@ -1175,7 +2910,7 @@
               <w:pStyle w:val="IEEETableCell"/>
             </w:pPr>
             <w:r>
-              <w:t>0.7432</w:t>
+              <w:t>0.0000</w:t>
             </w:r>
           </w:p>
         </w:tc>
@@ -1188,7 +2923,7 @@
               <w:pStyle w:val="IEEETableCell"/>
             </w:pPr>
             <w:r>
-              <w:t>0.0001</w:t>
+              <w:t>0.0000</w:t>
             </w:r>
           </w:p>
         </w:tc>
@@ -1203,7 +2938,7 @@
               <w:pStyle w:val="IEEETableCell"/>
             </w:pPr>
             <w:r>
-              <w:t>B_continuous</w:t>
+              <w:t>1% channel noise</w:t>
             </w:r>
           </w:p>
         </w:tc>
@@ -1216,7 +2951,7 @@
               <w:pStyle w:val="IEEETableCell"/>
             </w:pPr>
             <w:r>
-              <w:t>0.0011</w:t>
+              <w:t>0.0089</w:t>
             </w:r>
           </w:p>
         </w:tc>
@@ -1229,7 +2964,7 @@
               <w:pStyle w:val="IEEETableCell"/>
             </w:pPr>
             <w:r>
-              <w:t>0.7432</w:t>
+              <w:t>0.0134</w:t>
             </w:r>
           </w:p>
         </w:tc>
@@ -1242,7 +2977,7 @@
               <w:pStyle w:val="IEEETableCell"/>
             </w:pPr>
             <w:r>
-              <w:t>0.0001</w:t>
+              <w:t>0.0045</w:t>
             </w:r>
           </w:p>
         </w:tc>
@@ -1257,7 +2992,7 @@
               <w:pStyle w:val="IEEETableCell"/>
             </w:pPr>
             <w:r>
-              <w:t>C_anomaly_assisted</w:t>
+              <w:t>5% channel noise</w:t>
             </w:r>
           </w:p>
         </w:tc>
@@ -1270,7 +3005,7 @@
               <w:pStyle w:val="IEEETableCell"/>
             </w:pPr>
             <w:r>
-              <w:t>0.0015</w:t>
+              <w:t>0.0479</w:t>
             </w:r>
           </w:p>
         </w:tc>
@@ -1283,7 +3018,169 @@
               <w:pStyle w:val="IEEETableCell"/>
             </w:pPr>
             <w:r>
-              <w:t>0.7432</w:t>
+              <w:t>0.0503</w:t>
+            </w:r>
+          </w:p>
+        </w:tc>
+        <w:tc>
+          <w:tcPr>
+            <w:tcW w:type="dxa" w:w="2571"/>
+          </w:tcPr>
+          <w:p>
+            <w:pPr>
+              <w:pStyle w:val="IEEETableCell"/>
+            </w:pPr>
+            <w:r>
+              <w:t>0.0024</w:t>
+            </w:r>
+          </w:p>
+        </w:tc>
+      </w:tr>
+      <w:tr>
+        <w:tc>
+          <w:tcPr>
+            <w:tcW w:type="dxa" w:w="2571"/>
+          </w:tcPr>
+          <w:p>
+            <w:pPr>
+              <w:pStyle w:val="IEEETableCell"/>
+            </w:pPr>
+            <w:r>
+              <w:t>10% channel noise</w:t>
+            </w:r>
+          </w:p>
+        </w:tc>
+        <w:tc>
+          <w:tcPr>
+            <w:tcW w:type="dxa" w:w="2571"/>
+          </w:tcPr>
+          <w:p>
+            <w:pPr>
+              <w:pStyle w:val="IEEETableCell"/>
+            </w:pPr>
+            <w:r>
+              <w:t>0.0947</w:t>
+            </w:r>
+          </w:p>
+        </w:tc>
+        <w:tc>
+          <w:tcPr>
+            <w:tcW w:type="dxa" w:w="2571"/>
+          </w:tcPr>
+          <w:p>
+            <w:pPr>
+              <w:pStyle w:val="IEEETableCell"/>
+            </w:pPr>
+            <w:r>
+              <w:t>0.1009</w:t>
+            </w:r>
+          </w:p>
+        </w:tc>
+        <w:tc>
+          <w:tcPr>
+            <w:tcW w:type="dxa" w:w="2571"/>
+          </w:tcPr>
+          <w:p>
+            <w:pPr>
+              <w:pStyle w:val="IEEETableCell"/>
+            </w:pPr>
+            <w:r>
+              <w:t>0.0062</w:t>
+            </w:r>
+          </w:p>
+        </w:tc>
+      </w:tr>
+      <w:tr>
+        <w:tc>
+          <w:tcPr>
+            <w:tcW w:type="dxa" w:w="2571"/>
+          </w:tcPr>
+          <w:p>
+            <w:pPr>
+              <w:pStyle w:val="IEEETableCell"/>
+            </w:pPr>
+            <w:r>
+              <w:t>Intercept-resend Eve</w:t>
+            </w:r>
+          </w:p>
+        </w:tc>
+        <w:tc>
+          <w:tcPr>
+            <w:tcW w:type="dxa" w:w="2571"/>
+          </w:tcPr>
+          <w:p>
+            <w:pPr>
+              <w:pStyle w:val="IEEETableCell"/>
+            </w:pPr>
+            <w:r>
+              <w:t>0.2394</w:t>
+            </w:r>
+          </w:p>
+        </w:tc>
+        <w:tc>
+          <w:tcPr>
+            <w:tcW w:type="dxa" w:w="2571"/>
+          </w:tcPr>
+          <w:p>
+            <w:pPr>
+              <w:pStyle w:val="IEEETableCell"/>
+            </w:pPr>
+            <w:r>
+              <w:t>0.2447</w:t>
+            </w:r>
+          </w:p>
+        </w:tc>
+        <w:tc>
+          <w:tcPr>
+            <w:tcW w:type="dxa" w:w="2571"/>
+          </w:tcPr>
+          <w:p>
+            <w:pPr>
+              <w:pStyle w:val="IEEETableCell"/>
+            </w:pPr>
+            <w:r>
+              <w:t>0.0053</w:t>
+            </w:r>
+          </w:p>
+        </w:tc>
+      </w:tr>
+      <w:tr>
+        <w:tc>
+          <w:tcPr>
+            <w:tcW w:type="dxa" w:w="2571"/>
+          </w:tcPr>
+          <w:p>
+            <w:pPr>
+              <w:pStyle w:val="IEEETableCell"/>
+            </w:pPr>
+            <w:r>
+              <w:t>Eve + 2% noise</w:t>
+            </w:r>
+          </w:p>
+        </w:tc>
+        <w:tc>
+          <w:tcPr>
+            <w:tcW w:type="dxa" w:w="2571"/>
+          </w:tcPr>
+          <w:p>
+            <w:pPr>
+              <w:pStyle w:val="IEEETableCell"/>
+            </w:pPr>
+            <w:r>
+              <w:t>0.2642</w:t>
+            </w:r>
+          </w:p>
+        </w:tc>
+        <w:tc>
+          <w:tcPr>
+            <w:tcW w:type="dxa" w:w="2571"/>
+          </w:tcPr>
+          <w:p>
+            <w:pPr>
+              <w:pStyle w:val="IEEETableCell"/>
+            </w:pPr>
+            <w:r>
+              <w:t>0.2647</w:t>
             </w:r>
           </w:p>
         </w:tc>
@@ -1304,10 +3201,104 @@
     </w:tbl>
     <w:p>
       <w:pPr>
+        <w:jc w:val="center"/>
+      </w:pPr>
+      <w:r>
+        <w:drawing>
+          <wp:inline xmlns:a="http://schemas.openxmlformats.org/drawingml/2006/main" xmlns:pic="http://schemas.openxmlformats.org/drawingml/2006/picture">
+            <wp:extent cx="2926080" cy="1653871"/>
+            <wp:docPr id="22" name="Picture 22"/>
+            <wp:cNvGraphicFramePr>
+              <a:graphicFrameLocks noChangeAspect="1"/>
+            </wp:cNvGraphicFramePr>
+            <a:graphic>
+              <a:graphicData uri="http://schemas.openxmlformats.org/drawingml/2006/picture">
+                <pic:pic>
+                  <pic:nvPicPr>
+                    <pic:cNvPr id="0" name="bb84_cross_implementation_comparison.png"/>
+                    <pic:cNvPicPr/>
+                  </pic:nvPicPr>
+                  <pic:blipFill>
+                    <a:blip r:embed="rId33"/>
+                    <a:stretch>
+                      <a:fillRect/>
+                    </a:stretch>
+                  </pic:blipFill>
+                  <pic:spPr>
+                    <a:xfrm>
+                      <a:off x="0" y="0"/>
+                      <a:ext cx="2926080" cy="1653871"/>
+                    </a:xfrm>
+                    <a:prstGeom prst="rect"/>
+                  </pic:spPr>
+                </pic:pic>
+              </a:graphicData>
+            </a:graphic>
+          </wp:inline>
+        </w:drawing>
+      </w:r>
+    </w:p>
+    <w:p>
+      <w:pPr>
+        <w:pStyle w:val="IEEEFigureCaptionMulti-Lines"/>
+      </w:pPr>
+      <w:r>
+        <w:t>Fig. 22. Mean QBER by condition, protocol-level simulator vs. Qiskit circuit simulator. The two independent implementations agree closely across all six conditions.</w:t>
+      </w:r>
+    </w:p>
+    <w:p>
+      <w:pPr>
+        <w:jc w:val="center"/>
+      </w:pPr>
+      <w:r>
+        <w:drawing>
+          <wp:inline xmlns:a="http://schemas.openxmlformats.org/drawingml/2006/main" xmlns:pic="http://schemas.openxmlformats.org/drawingml/2006/picture">
+            <wp:extent cx="2743200" cy="1995055"/>
+            <wp:docPr id="23" name="Picture 23"/>
+            <wp:cNvGraphicFramePr>
+              <a:graphicFrameLocks noChangeAspect="1"/>
+            </wp:cNvGraphicFramePr>
+            <a:graphic>
+              <a:graphicData uri="http://schemas.openxmlformats.org/drawingml/2006/picture">
+                <pic:pic>
+                  <pic:nvPicPr>
+                    <pic:cNvPr id="0" name="bb84_qiskit_eve_vs_noeve_distribution.png"/>
+                    <pic:cNvPicPr/>
+                  </pic:nvPicPr>
+                  <pic:blipFill>
+                    <a:blip r:embed="rId34"/>
+                    <a:stretch>
+                      <a:fillRect/>
+                    </a:stretch>
+                  </pic:blipFill>
+                  <pic:spPr>
+                    <a:xfrm>
+                      <a:off x="0" y="0"/>
+                      <a:ext cx="2743200" cy="1995055"/>
+                    </a:xfrm>
+                    <a:prstGeom prst="rect"/>
+                  </pic:spPr>
+                </pic:pic>
+              </a:graphicData>
+            </a:graphic>
+          </wp:inline>
+        </w:drawing>
+      </w:r>
+    </w:p>
+    <w:p>
+      <w:pPr>
+        <w:pStyle w:val="IEEEFigureCaptionMulti-Lines"/>
+      </w:pPr>
+      <w:r>
+        <w:t>Fig. 23. Qiskit circuit simulator: per-trial QBER distribution with and without an intercept-resend eavesdropper (n=30 each), against the 0.11 detection threshold.</w:t>
+      </w:r>
+    </w:p>
+    <w:p>
+      <w:pPr>
         <w:pStyle w:val="IEEEParagraph"/>
       </w:pPr>
       <w:r>
-        <w:t>Categorical (risk-level) and continuous (probability-based) routing produced behaviorally identical results on this dataset. Augmenting routing with the existing classical anomaly detector's score added no additional fraud coverage while increasing benign escalation approximately fivefold. Augmenting routing with a quantum-derived classical/quantum disagreement signal, evaluated on its own appropriately scoped sample, increased fraud coverage by only 1.33 percentage points (1 additional fraud case) while increasing benign escalation by a factor of 16.0, decisively failing the pre-specified cost budget for this experiment.</w:t>
+        <w:t>The two independent implementations agree closely (largest absolute difference 0.62 percentage points, comparing 200-bit against 2000-bit per-trial samples), and the Qiskit implementation likewise detected the intercept-resend eavesdropper in 30 of 30 trials at the same 0.11 QBER threshold. This is cross-implementation validation that the protocol-level simulator's sifting and QBER-estimation logic correctly reproduces the behavior of explicit per-qubit state preparation and measurement circuits. It does not change BB84's status in this project: running these circuits on a classical simulator, or hypothetically on real quantum hardware, still transmits no physical photon and exercises no physical no-cloning property. BB84 in this project remains, in every implementation, a software simulation.</w:t>
       </w:r>
     </w:p>
     <w:p>
@@ -1315,15 +3306,1294 @@
         <w:pStyle w:val="IEEEHeading1"/>
       </w:pPr>
       <w:r>
+        <w:t>Layer 1-to-Layer 2 Integration</w:t>
+      </w:r>
+    </w:p>
+    <w:p>
+      <w:pPr>
+        <w:pStyle w:val="IEEEParagraph"/>
+      </w:pPr>
+      <w:r>
+        <w:t>The refined architectural conclusion of this study is that fraud risk and cryptographic-quantum-risk posture must be modeled as separate axes rather than one derived from the other.</w:t>
+      </w:r>
+    </w:p>
+    <w:p>
+      <w:pPr>
+        <w:jc w:val="center"/>
+      </w:pPr>
+      <w:r>
+        <w:drawing>
+          <wp:inline xmlns:a="http://schemas.openxmlformats.org/drawingml/2006/main" xmlns:pic="http://schemas.openxmlformats.org/drawingml/2006/picture">
+            <wp:extent cx="2560320" cy="3189171"/>
+            <wp:docPr id="24" name="Picture 24"/>
+            <wp:cNvGraphicFramePr>
+              <a:graphicFrameLocks noChangeAspect="1"/>
+            </wp:cNvGraphicFramePr>
+            <a:graphic>
+              <a:graphicData uri="http://schemas.openxmlformats.org/drawingml/2006/picture">
+                <pic:pic>
+                  <pic:nvPicPr>
+                    <pic:cNvPr id="0" name="refined_fraud_vs_crypto_risk.png"/>
+                    <pic:cNvPicPr/>
+                  </pic:nvPicPr>
+                  <pic:blipFill>
+                    <a:blip r:embed="rId35"/>
+                    <a:stretch>
+                      <a:fillRect/>
+                    </a:stretch>
+                  </pic:blipFill>
+                  <pic:spPr>
+                    <a:xfrm>
+                      <a:off x="0" y="0"/>
+                      <a:ext cx="2560320" cy="3189171"/>
+                    </a:xfrm>
+                    <a:prstGeom prst="rect"/>
+                  </pic:spPr>
+                </pic:pic>
+              </a:graphicData>
+            </a:graphic>
+          </wp:inline>
+        </w:drawing>
+      </w:r>
+    </w:p>
+    <w:p>
+      <w:pPr>
+        <w:pStyle w:val="IEEEFigureCaptionMulti-Lines"/>
+      </w:pPr>
+      <w:r>
+        <w:t>Fig. 24. Refined architecture separating fraud intelligence from security requirements before the security policy engine -- the key systems-level insight of this study.</w:t>
+      </w:r>
+    </w:p>
+    <w:p>
+      <w:pPr>
+        <w:pStyle w:val="IEEETableCaption"/>
+      </w:pPr>
+      <w:r>
+        <w:t>TABLE VII</w:t>
+      </w:r>
+    </w:p>
+    <w:p>
+      <w:pPr>
+        <w:pStyle w:val="IEEETableCaption"/>
+      </w:pPr>
+      <w:r>
+        <w:t>Routing Policy Ablation (Production Test Fold, n=55,133)</w:t>
+      </w:r>
+    </w:p>
+    <w:tbl>
+      <w:tblPr>
+        <w:tblStyle w:val="TableGrid"/>
+        <w:tblW w:type="auto" w:w="0"/>
+        <w:tblLook w:firstColumn="1" w:firstRow="1" w:lastColumn="0" w:lastRow="0" w:noHBand="0" w:noVBand="1" w:val="04A0"/>
+      </w:tblPr>
+      <w:tblGrid>
+        <w:gridCol w:w="2571"/>
+        <w:gridCol w:w="2571"/>
+        <w:gridCol w:w="2571"/>
+        <w:gridCol w:w="2571"/>
+      </w:tblGrid>
+      <w:tr>
+        <w:tc>
+          <w:tcPr>
+            <w:tcW w:type="dxa" w:w="2571"/>
+          </w:tcPr>
+          <w:p>
+            <w:pPr>
+              <w:pStyle w:val="IEEETableHeaderCentered"/>
+            </w:pPr>
+            <w:r>
+              <w:t>policy</w:t>
+            </w:r>
+          </w:p>
+        </w:tc>
+        <w:tc>
+          <w:tcPr>
+            <w:tcW w:type="dxa" w:w="2571"/>
+          </w:tcPr>
+          <w:p>
+            <w:pPr>
+              <w:pStyle w:val="IEEETableHeaderCentered"/>
+            </w:pPr>
+            <w:r>
+              <w:t>security_escalation_rate</w:t>
+            </w:r>
+          </w:p>
+        </w:tc>
+        <w:tc>
+          <w:tcPr>
+            <w:tcW w:type="dxa" w:w="2571"/>
+          </w:tcPr>
+          <w:p>
+            <w:pPr>
+              <w:pStyle w:val="IEEETableHeaderCentered"/>
+            </w:pPr>
+            <w:r>
+              <w:t>fraud_weighted_coverage</w:t>
+            </w:r>
+          </w:p>
+        </w:tc>
+        <w:tc>
+          <w:tcPr>
+            <w:tcW w:type="dxa" w:w="2571"/>
+          </w:tcPr>
+          <w:p>
+            <w:pPr>
+              <w:pStyle w:val="IEEETableHeaderCentered"/>
+            </w:pPr>
+            <w:r>
+              <w:t>benign_escalation_rate</w:t>
+            </w:r>
+          </w:p>
+        </w:tc>
+      </w:tr>
+      <w:tr>
+        <w:tc>
+          <w:tcPr>
+            <w:tcW w:type="dxa" w:w="2571"/>
+          </w:tcPr>
+          <w:p>
+            <w:pPr>
+              <w:pStyle w:val="IEEETableCell"/>
+            </w:pPr>
+            <w:r>
+              <w:t>A_categorical</w:t>
+            </w:r>
+          </w:p>
+        </w:tc>
+        <w:tc>
+          <w:tcPr>
+            <w:tcW w:type="dxa" w:w="2571"/>
+          </w:tcPr>
+          <w:p>
+            <w:pPr>
+              <w:pStyle w:val="IEEETableCell"/>
+            </w:pPr>
+            <w:r>
+              <w:t>0.0011</w:t>
+            </w:r>
+          </w:p>
+        </w:tc>
+        <w:tc>
+          <w:tcPr>
+            <w:tcW w:type="dxa" w:w="2571"/>
+          </w:tcPr>
+          <w:p>
+            <w:pPr>
+              <w:pStyle w:val="IEEETableCell"/>
+            </w:pPr>
+            <w:r>
+              <w:t>0.7432</w:t>
+            </w:r>
+          </w:p>
+        </w:tc>
+        <w:tc>
+          <w:tcPr>
+            <w:tcW w:type="dxa" w:w="2571"/>
+          </w:tcPr>
+          <w:p>
+            <w:pPr>
+              <w:pStyle w:val="IEEETableCell"/>
+            </w:pPr>
+            <w:r>
+              <w:t>0.0001</w:t>
+            </w:r>
+          </w:p>
+        </w:tc>
+      </w:tr>
+      <w:tr>
+        <w:tc>
+          <w:tcPr>
+            <w:tcW w:type="dxa" w:w="2571"/>
+          </w:tcPr>
+          <w:p>
+            <w:pPr>
+              <w:pStyle w:val="IEEETableCell"/>
+            </w:pPr>
+            <w:r>
+              <w:t>B_continuous</w:t>
+            </w:r>
+          </w:p>
+        </w:tc>
+        <w:tc>
+          <w:tcPr>
+            <w:tcW w:type="dxa" w:w="2571"/>
+          </w:tcPr>
+          <w:p>
+            <w:pPr>
+              <w:pStyle w:val="IEEETableCell"/>
+            </w:pPr>
+            <w:r>
+              <w:t>0.0011</w:t>
+            </w:r>
+          </w:p>
+        </w:tc>
+        <w:tc>
+          <w:tcPr>
+            <w:tcW w:type="dxa" w:w="2571"/>
+          </w:tcPr>
+          <w:p>
+            <w:pPr>
+              <w:pStyle w:val="IEEETableCell"/>
+            </w:pPr>
+            <w:r>
+              <w:t>0.7432</w:t>
+            </w:r>
+          </w:p>
+        </w:tc>
+        <w:tc>
+          <w:tcPr>
+            <w:tcW w:type="dxa" w:w="2571"/>
+          </w:tcPr>
+          <w:p>
+            <w:pPr>
+              <w:pStyle w:val="IEEETableCell"/>
+            </w:pPr>
+            <w:r>
+              <w:t>0.0001</w:t>
+            </w:r>
+          </w:p>
+        </w:tc>
+      </w:tr>
+      <w:tr>
+        <w:tc>
+          <w:tcPr>
+            <w:tcW w:type="dxa" w:w="2571"/>
+          </w:tcPr>
+          <w:p>
+            <w:pPr>
+              <w:pStyle w:val="IEEETableCell"/>
+            </w:pPr>
+            <w:r>
+              <w:t>C_anomaly_assisted</w:t>
+            </w:r>
+          </w:p>
+        </w:tc>
+        <w:tc>
+          <w:tcPr>
+            <w:tcW w:type="dxa" w:w="2571"/>
+          </w:tcPr>
+          <w:p>
+            <w:pPr>
+              <w:pStyle w:val="IEEETableCell"/>
+            </w:pPr>
+            <w:r>
+              <w:t>0.0015</w:t>
+            </w:r>
+          </w:p>
+        </w:tc>
+        <w:tc>
+          <w:tcPr>
+            <w:tcW w:type="dxa" w:w="2571"/>
+          </w:tcPr>
+          <w:p>
+            <w:pPr>
+              <w:pStyle w:val="IEEETableCell"/>
+            </w:pPr>
+            <w:r>
+              <w:t>0.7432</w:t>
+            </w:r>
+          </w:p>
+        </w:tc>
+        <w:tc>
+          <w:tcPr>
+            <w:tcW w:type="dxa" w:w="2571"/>
+          </w:tcPr>
+          <w:p>
+            <w:pPr>
+              <w:pStyle w:val="IEEETableCell"/>
+            </w:pPr>
+            <w:r>
+              <w:t>0.0005</w:t>
+            </w:r>
+          </w:p>
+        </w:tc>
+      </w:tr>
+    </w:tbl>
+    <w:p>
+      <w:pPr>
+        <w:jc w:val="center"/>
+      </w:pPr>
+      <w:r>
+        <w:drawing>
+          <wp:inline xmlns:a="http://schemas.openxmlformats.org/drawingml/2006/main" xmlns:pic="http://schemas.openxmlformats.org/drawingml/2006/picture">
+            <wp:extent cx="3017520" cy="1135030"/>
+            <wp:docPr id="25" name="Picture 25"/>
+            <wp:cNvGraphicFramePr>
+              <a:graphicFrameLocks noChangeAspect="1"/>
+            </wp:cNvGraphicFramePr>
+            <a:graphic>
+              <a:graphicData uri="http://schemas.openxmlformats.org/drawingml/2006/picture">
+                <pic:pic>
+                  <pic:nvPicPr>
+                    <pic:cNvPr id="0" name="policy_coverage_and_cost.png"/>
+                    <pic:cNvPicPr/>
+                  </pic:nvPicPr>
+                  <pic:blipFill>
+                    <a:blip r:embed="rId36"/>
+                    <a:stretch>
+                      <a:fillRect/>
+                    </a:stretch>
+                  </pic:blipFill>
+                  <pic:spPr>
+                    <a:xfrm>
+                      <a:off x="0" y="0"/>
+                      <a:ext cx="3017520" cy="1135030"/>
+                    </a:xfrm>
+                    <a:prstGeom prst="rect"/>
+                  </pic:spPr>
+                </pic:pic>
+              </a:graphicData>
+            </a:graphic>
+          </wp:inline>
+        </w:drawing>
+      </w:r>
+    </w:p>
+    <w:p>
+      <w:pPr>
+        <w:pStyle w:val="IEEEFigureCaptionMulti-Lines"/>
+      </w:pPr>
+      <w:r>
+        <w:t>Fig. 25. Fraud-Weighted Enhanced-Security Coverage (left) and Benign Escalation Rate (right) by policy. Categorical and continuous routing are behaviorally identical; anomaly-assisted routing adds cost without adding coverage.</w:t>
+      </w:r>
+    </w:p>
+    <w:p>
+      <w:pPr>
+        <w:pStyle w:val="IEEEParagraph"/>
+        <w:jc w:val="center"/>
+      </w:pPr>
+      <w:r>
+        <w:rPr>
+          <w:i/>
+        </w:rPr>
+        <w:t>SER = N_escalated / N_total</w:t>
+      </w:r>
+      <w:r>
+        <w:rPr>
+          <w:i w:val="0"/>
+        </w:rPr>
+        <w:tab/>
+        <w:t>(15)</w:t>
+      </w:r>
+    </w:p>
+    <w:p>
+      <w:pPr>
+        <w:pStyle w:val="IEEEParagraph"/>
+        <w:jc w:val="center"/>
+      </w:pPr>
+      <w:r>
+        <w:rPr>
+          <w:i/>
+        </w:rPr>
+        <w:t>FWC = N_fraud,escalated / N_fraud,total</w:t>
+      </w:r>
+      <w:r>
+        <w:rPr>
+          <w:i w:val="0"/>
+        </w:rPr>
+        <w:tab/>
+        <w:t>(16)</w:t>
+      </w:r>
+    </w:p>
+    <w:p>
+      <w:pPr>
+        <w:pStyle w:val="IEEEParagraph"/>
+        <w:jc w:val="center"/>
+      </w:pPr>
+      <w:r>
+        <w:rPr>
+          <w:i/>
+        </w:rPr>
+        <w:t>BER = N_legit,escalated / N_legit,total</w:t>
+      </w:r>
+      <w:r>
+        <w:rPr>
+          <w:i w:val="0"/>
+        </w:rPr>
+        <w:tab/>
+        <w:t>(17)</w:t>
+      </w:r>
+    </w:p>
+    <w:p>
+      <w:pPr>
+        <w:jc w:val="center"/>
+      </w:pPr>
+      <w:r>
+        <w:drawing>
+          <wp:inline xmlns:a="http://schemas.openxmlformats.org/drawingml/2006/main" xmlns:pic="http://schemas.openxmlformats.org/drawingml/2006/picture">
+            <wp:extent cx="2560320" cy="1179473"/>
+            <wp:docPr id="26" name="Picture 26"/>
+            <wp:cNvGraphicFramePr>
+              <a:graphicFrameLocks noChangeAspect="1"/>
+            </wp:cNvGraphicFramePr>
+            <a:graphic>
+              <a:graphicData uri="http://schemas.openxmlformats.org/drawingml/2006/picture">
+                <pic:pic>
+                  <pic:nvPicPr>
+                    <pic:cNvPr id="0" name="quantum_auxiliary_routing.png"/>
+                    <pic:cNvPicPr/>
+                  </pic:nvPicPr>
+                  <pic:blipFill>
+                    <a:blip r:embed="rId37"/>
+                    <a:stretch>
+                      <a:fillRect/>
+                    </a:stretch>
+                  </pic:blipFill>
+                  <pic:spPr>
+                    <a:xfrm>
+                      <a:off x="0" y="0"/>
+                      <a:ext cx="2560320" cy="1179473"/>
+                    </a:xfrm>
+                    <a:prstGeom prst="rect"/>
+                  </pic:spPr>
+                </pic:pic>
+              </a:graphicData>
+            </a:graphic>
+          </wp:inline>
+        </w:drawing>
+      </w:r>
+    </w:p>
+    <w:p>
+      <w:pPr>
+        <w:pStyle w:val="IEEEFigureCaptionMulti-Lines"/>
+      </w:pPr>
+      <w:r>
+        <w:t>Fig. 26. Quantum-assisted routing (Policy D) vs. continuous routing alone (Policy B), on the separate locked confirmation sample. Coverage gain is marginal; benign-escalation cost is severe.</w:t>
+      </w:r>
+    </w:p>
+    <w:p>
+      <w:pPr>
+        <w:pStyle w:val="IEEEParagraph"/>
+      </w:pPr>
+      <w:r>
+        <w:t>Categorical and continuous routing produced behaviorally identical results on this dataset. Anomaly-assisted routing added no additional fraud coverage while increasing benign escalation approximately fivefold. Quantum-assisted routing, evaluated on its own appropriately scoped sample, increased fraud coverage by only 1.33 percentage points (1 additional fraud case) while increasing benign escalation by a factor of 16.0, decisively failing the pre-specified cost budget for this experiment. Adding more sophisticated risk signals does not automatically improve security orchestration -- rejecting a signal that costs more than it is worth is the correct systems decision, and the pre-specified protocol is what makes this conclusion credible rather than post-hoc.</w:t>
+      </w:r>
+    </w:p>
+    <w:p>
+      <w:pPr>
+        <w:pStyle w:val="IEEEHeading1"/>
+      </w:pPr>
+      <w:r>
+        <w:t>Research Question Summary</w:t>
+      </w:r>
+    </w:p>
+    <w:p>
+      <w:pPr>
+        <w:pStyle w:val="IEEETableCaption"/>
+      </w:pPr>
+      <w:r>
+        <w:t>TABLE VIII</w:t>
+      </w:r>
+    </w:p>
+    <w:p>
+      <w:pPr>
+        <w:pStyle w:val="IEEETableCaption"/>
+      </w:pPr>
+      <w:r>
+        <w:t>Research Questions, Findings, and Interpretation</w:t>
+      </w:r>
+    </w:p>
+    <w:tbl>
+      <w:tblPr>
+        <w:tblStyle w:val="TableGrid"/>
+        <w:tblW w:type="auto" w:w="0"/>
+        <w:tblLook w:firstColumn="1" w:firstRow="1" w:lastColumn="0" w:lastRow="0" w:noHBand="0" w:noVBand="1" w:val="04A0"/>
+      </w:tblPr>
+      <w:tblGrid>
+        <w:gridCol w:w="3428"/>
+        <w:gridCol w:w="3428"/>
+        <w:gridCol w:w="3428"/>
+      </w:tblGrid>
+      <w:tr>
+        <w:tc>
+          <w:tcPr>
+            <w:tcW w:type="dxa" w:w="3428"/>
+          </w:tcPr>
+          <w:p>
+            <w:pPr>
+              <w:pStyle w:val="IEEETableHeaderCentered"/>
+            </w:pPr>
+            <w:r>
+              <w:t>Research Question</w:t>
+            </w:r>
+          </w:p>
+        </w:tc>
+        <w:tc>
+          <w:tcPr>
+            <w:tcW w:type="dxa" w:w="3428"/>
+          </w:tcPr>
+          <w:p>
+            <w:pPr>
+              <w:pStyle w:val="IEEETableHeaderCentered"/>
+            </w:pPr>
+            <w:r>
+              <w:t>Finding</w:t>
+            </w:r>
+          </w:p>
+        </w:tc>
+        <w:tc>
+          <w:tcPr>
+            <w:tcW w:type="dxa" w:w="3428"/>
+          </w:tcPr>
+          <w:p>
+            <w:pPr>
+              <w:pStyle w:val="IEEETableHeaderCentered"/>
+            </w:pPr>
+            <w:r>
+              <w:t>Interpretation</w:t>
+            </w:r>
+          </w:p>
+        </w:tc>
+      </w:tr>
+      <w:tr>
+        <w:tc>
+          <w:tcPr>
+            <w:tcW w:type="dxa" w:w="3428"/>
+          </w:tcPr>
+          <w:p>
+            <w:pPr>
+              <w:pStyle w:val="IEEETableCell"/>
+            </w:pPr>
+            <w:r>
+              <w:t>Does Local-Sum improve Global QNN?</w:t>
+            </w:r>
+          </w:p>
+        </w:tc>
+        <w:tc>
+          <w:tcPr>
+            <w:tcW w:type="dxa" w:w="3428"/>
+          </w:tcPr>
+          <w:p>
+            <w:pPr>
+              <w:pStyle w:val="IEEETableCell"/>
+            </w:pPr>
+            <w:r>
+              <w:t>SUPPORTED</w:t>
+            </w:r>
+          </w:p>
+        </w:tc>
+        <w:tc>
+          <w:tcPr>
+            <w:tcW w:type="dxa" w:w="3428"/>
+          </w:tcPr>
+          <w:p>
+            <w:pPr>
+              <w:pStyle w:val="IEEETableCell"/>
+            </w:pPr>
+            <w:r>
+              <w:t>20-seed paired bootstrap/Wilcoxon/permutation</w:t>
+            </w:r>
+          </w:p>
+        </w:tc>
+      </w:tr>
+      <w:tr>
+        <w:tc>
+          <w:tcPr>
+            <w:tcW w:type="dxa" w:w="3428"/>
+          </w:tcPr>
+          <w:p>
+            <w:pPr>
+              <w:pStyle w:val="IEEETableCell"/>
+            </w:pPr>
+            <w:r>
+              <w:t>Does quantum beat XGBoost?</w:t>
+            </w:r>
+          </w:p>
+        </w:tc>
+        <w:tc>
+          <w:tcPr>
+            <w:tcW w:type="dxa" w:w="3428"/>
+          </w:tcPr>
+          <w:p>
+            <w:pPr>
+              <w:pStyle w:val="IEEETableCell"/>
+            </w:pPr>
+            <w:r>
+              <w:t>NOT SUPPORTED</w:t>
+            </w:r>
+          </w:p>
+        </w:tc>
+        <w:tc>
+          <w:tcPr>
+            <w:tcW w:type="dxa" w:w="3428"/>
+          </w:tcPr>
+          <w:p>
+            <w:pPr>
+              <w:pStyle w:val="IEEETableCell"/>
+            </w:pPr>
+            <w:r>
+              <w:t>95% CI crosses zero</w:t>
+            </w:r>
+          </w:p>
+        </w:tc>
+      </w:tr>
+      <w:tr>
+        <w:tc>
+          <w:tcPr>
+            <w:tcW w:type="dxa" w:w="3428"/>
+          </w:tcPr>
+          <w:p>
+            <w:pPr>
+              <w:pStyle w:val="IEEETableCell"/>
+            </w:pPr>
+            <w:r>
+              <w:t>Does quantum give verified incremental utility?</w:t>
+            </w:r>
+          </w:p>
+        </w:tc>
+        <w:tc>
+          <w:tcPr>
+            <w:tcW w:type="dxa" w:w="3428"/>
+          </w:tcPr>
+          <w:p>
+            <w:pPr>
+              <w:pStyle w:val="IEEETableCell"/>
+            </w:pPr>
+            <w:r>
+              <w:t>NOT VERIFIED</w:t>
+            </w:r>
+          </w:p>
+        </w:tc>
+        <w:tc>
+          <w:tcPr>
+            <w:tcW w:type="dxa" w:w="3428"/>
+          </w:tcPr>
+          <w:p>
+            <w:pPr>
+              <w:pStyle w:val="IEEETableCell"/>
+            </w:pPr>
+            <w:r>
+              <w:t>Classical control performs as well or better</w:t>
+            </w:r>
+          </w:p>
+        </w:tc>
+      </w:tr>
+      <w:tr>
+        <w:tc>
+          <w:tcPr>
+            <w:tcW w:type="dxa" w:w="3428"/>
+          </w:tcPr>
+          <w:p>
+            <w:pPr>
+              <w:pStyle w:val="IEEETableCell"/>
+            </w:pPr>
+            <w:r>
+              <w:t>Can PQC be integrated?</w:t>
+            </w:r>
+          </w:p>
+        </w:tc>
+        <w:tc>
+          <w:tcPr>
+            <w:tcW w:type="dxa" w:w="3428"/>
+          </w:tcPr>
+          <w:p>
+            <w:pPr>
+              <w:pStyle w:val="IEEETableCell"/>
+            </w:pPr>
+            <w:r>
+              <w:t>YES</w:t>
+            </w:r>
+          </w:p>
+        </w:tc>
+        <w:tc>
+          <w:tcPr>
+            <w:tcW w:type="dxa" w:w="3428"/>
+          </w:tcPr>
+          <w:p>
+            <w:pPr>
+              <w:pStyle w:val="IEEETableCell"/>
+            </w:pPr>
+            <w:r>
+              <w:t>Implemented, tested, benchmarked</w:t>
+            </w:r>
+          </w:p>
+        </w:tc>
+      </w:tr>
+      <w:tr>
+        <w:tc>
+          <w:tcPr>
+            <w:tcW w:type="dxa" w:w="3428"/>
+          </w:tcPr>
+          <w:p>
+            <w:pPr>
+              <w:pStyle w:val="IEEETableCell"/>
+            </w:pPr>
+            <w:r>
+              <w:t>What overhead does PQC introduce?</w:t>
+            </w:r>
+          </w:p>
+        </w:tc>
+        <w:tc>
+          <w:tcPr>
+            <w:tcW w:type="dxa" w:w="3428"/>
+          </w:tcPr>
+          <w:p>
+            <w:pPr>
+              <w:pStyle w:val="IEEETableCell"/>
+            </w:pPr>
+            <w:r>
+              <w:t>Substantial, implementation-dependent</w:t>
+            </w:r>
+          </w:p>
+        </w:tc>
+        <w:tc>
+          <w:tcPr>
+            <w:tcW w:type="dxa" w:w="3428"/>
+          </w:tcPr>
+          <w:p>
+            <w:pPr>
+              <w:pStyle w:val="IEEETableCell"/>
+            </w:pPr>
+            <w:r>
+              <w:t>Up to ~15s/signature (SLH-DSA, pure Python)</w:t>
+            </w:r>
+          </w:p>
+        </w:tc>
+      </w:tr>
+      <w:tr>
+        <w:tc>
+          <w:tcPr>
+            <w:tcW w:type="dxa" w:w="3428"/>
+          </w:tcPr>
+          <w:p>
+            <w:pPr>
+              <w:pStyle w:val="IEEETableCell"/>
+            </w:pPr>
+            <w:r>
+              <w:t>Does BB84 reproduce expected behavior?</w:t>
+            </w:r>
+          </w:p>
+        </w:tc>
+        <w:tc>
+          <w:tcPr>
+            <w:tcW w:type="dxa" w:w="3428"/>
+          </w:tcPr>
+          <w:p>
+            <w:pPr>
+              <w:pStyle w:val="IEEETableCell"/>
+            </w:pPr>
+            <w:r>
+              <w:t>YES, under stated conditions</w:t>
+            </w:r>
+          </w:p>
+        </w:tc>
+        <w:tc>
+          <w:tcPr>
+            <w:tcW w:type="dxa" w:w="3428"/>
+          </w:tcPr>
+          <w:p>
+            <w:pPr>
+              <w:pStyle w:val="IEEETableCell"/>
+            </w:pPr>
+            <w:r>
+              <w:t>30/30 Eve detections</w:t>
+            </w:r>
+          </w:p>
+        </w:tc>
+      </w:tr>
+      <w:tr>
+        <w:tc>
+          <w:tcPr>
+            <w:tcW w:type="dxa" w:w="3428"/>
+          </w:tcPr>
+          <w:p>
+            <w:pPr>
+              <w:pStyle w:val="IEEETableCell"/>
+            </w:pPr>
+            <w:r>
+              <w:t>Does quantum/anomaly-assisted routing help under the cost budget?</w:t>
+            </w:r>
+          </w:p>
+        </w:tc>
+        <w:tc>
+          <w:tcPr>
+            <w:tcW w:type="dxa" w:w="3428"/>
+          </w:tcPr>
+          <w:p>
+            <w:pPr>
+              <w:pStyle w:val="IEEETableCell"/>
+            </w:pPr>
+            <w:r>
+              <w:t>NOT SUPPORTED</w:t>
+            </w:r>
+          </w:p>
+        </w:tc>
+        <w:tc>
+          <w:tcPr>
+            <w:tcW w:type="dxa" w:w="3428"/>
+          </w:tcPr>
+          <w:p>
+            <w:pPr>
+              <w:pStyle w:val="IEEETableCell"/>
+            </w:pPr>
+            <w:r>
+              <w:t>Fails pre-specified budget by 5-16x</w:t>
+            </w:r>
+          </w:p>
+        </w:tc>
+      </w:tr>
+      <w:tr>
+        <w:tc>
+          <w:tcPr>
+            <w:tcW w:type="dxa" w:w="3428"/>
+          </w:tcPr>
+          <w:p>
+            <w:pPr>
+              <w:pStyle w:val="IEEETableCell"/>
+            </w:pPr>
+            <w:r>
+              <w:t>Architectural lesson?</w:t>
+            </w:r>
+          </w:p>
+        </w:tc>
+        <w:tc>
+          <w:tcPr>
+            <w:tcW w:type="dxa" w:w="3428"/>
+          </w:tcPr>
+          <w:p>
+            <w:pPr>
+              <w:pStyle w:val="IEEETableCell"/>
+            </w:pPr>
+            <w:r>
+              <w:t>Fraud risk != cryptographic risk</w:t>
+            </w:r>
+          </w:p>
+        </w:tc>
+        <w:tc>
+          <w:tcPr>
+            <w:tcW w:type="dxa" w:w="3428"/>
+          </w:tcPr>
+          <w:p>
+            <w:pPr>
+              <w:pStyle w:val="IEEETableCell"/>
+            </w:pPr>
+            <w:r>
+              <w:t>Must be modeled as separate axes</w:t>
+            </w:r>
+          </w:p>
+        </w:tc>
+      </w:tr>
+    </w:tbl>
+    <w:p>
+      <w:pPr>
+        <w:pStyle w:val="IEEEHeading1"/>
+      </w:pPr>
+      <w:r>
         <w:t>Scientific Contribution</w:t>
       </w:r>
     </w:p>
     <w:p>
       <w:pPr>
+        <w:pStyle w:val="IEEETableCaption"/>
+      </w:pPr>
+      <w:r>
+        <w:t>TABLE IX</w:t>
+      </w:r>
+    </w:p>
+    <w:p>
+      <w:pPr>
+        <w:pStyle w:val="IEEETableCaption"/>
+      </w:pPr>
+      <w:r>
+        <w:t>Scientific Contribution Matrix</w:t>
+      </w:r>
+    </w:p>
+    <w:tbl>
+      <w:tblPr>
+        <w:tblStyle w:val="TableGrid"/>
+        <w:tblW w:type="auto" w:w="0"/>
+        <w:tblLook w:firstColumn="1" w:firstRow="1" w:lastColumn="0" w:lastRow="0" w:noHBand="0" w:noVBand="1" w:val="04A0"/>
+      </w:tblPr>
+      <w:tblGrid>
+        <w:gridCol w:w="2571"/>
+        <w:gridCol w:w="2571"/>
+        <w:gridCol w:w="2571"/>
+        <w:gridCol w:w="2571"/>
+      </w:tblGrid>
+      <w:tr>
+        <w:tc>
+          <w:tcPr>
+            <w:tcW w:type="dxa" w:w="2571"/>
+          </w:tcPr>
+          <w:p>
+            <w:pPr>
+              <w:pStyle w:val="IEEETableHeaderCentered"/>
+            </w:pPr>
+            <w:r>
+              <w:t>Contribution</w:t>
+            </w:r>
+          </w:p>
+        </w:tc>
+        <w:tc>
+          <w:tcPr>
+            <w:tcW w:type="dxa" w:w="2571"/>
+          </w:tcPr>
+          <w:p>
+            <w:pPr>
+              <w:pStyle w:val="IEEETableHeaderCentered"/>
+            </w:pPr>
+            <w:r>
+              <w:t>Evidence</w:t>
+            </w:r>
+          </w:p>
+        </w:tc>
+        <w:tc>
+          <w:tcPr>
+            <w:tcW w:type="dxa" w:w="2571"/>
+          </w:tcPr>
+          <w:p>
+            <w:pPr>
+              <w:pStyle w:val="IEEETableHeaderCentered"/>
+            </w:pPr>
+            <w:r>
+              <w:t>Establishes</w:t>
+            </w:r>
+          </w:p>
+        </w:tc>
+        <w:tc>
+          <w:tcPr>
+            <w:tcW w:type="dxa" w:w="2571"/>
+          </w:tcPr>
+          <w:p>
+            <w:pPr>
+              <w:pStyle w:val="IEEETableHeaderCentered"/>
+            </w:pPr>
+            <w:r>
+              <w:t>Does Not Establish</w:t>
+            </w:r>
+          </w:p>
+        </w:tc>
+      </w:tr>
+      <w:tr>
+        <w:tc>
+          <w:tcPr>
+            <w:tcW w:type="dxa" w:w="2571"/>
+          </w:tcPr>
+          <w:p>
+            <w:pPr>
+              <w:pStyle w:val="IEEETableCell"/>
+            </w:pPr>
+            <w:r>
+              <w:t>Empirical QML</w:t>
+            </w:r>
+          </w:p>
+        </w:tc>
+        <w:tc>
+          <w:tcPr>
+            <w:tcW w:type="dxa" w:w="2571"/>
+          </w:tcPr>
+          <w:p>
+            <w:pPr>
+              <w:pStyle w:val="IEEETableCell"/>
+            </w:pPr>
+            <w:r>
+              <w:t>20 paired seeds + CI/tests</w:t>
+            </w:r>
+          </w:p>
+        </w:tc>
+        <w:tc>
+          <w:tcPr>
+            <w:tcW w:type="dxa" w:w="2571"/>
+          </w:tcPr>
+          <w:p>
+            <w:pPr>
+              <w:pStyle w:val="IEEETableCell"/>
+            </w:pPr>
+            <w:r>
+              <w:t>Observable design improves matched QNN</w:t>
+            </w:r>
+          </w:p>
+        </w:tc>
+        <w:tc>
+          <w:tcPr>
+            <w:tcW w:type="dxa" w:w="2571"/>
+          </w:tcPr>
+          <w:p>
+            <w:pPr>
+              <w:pStyle w:val="IEEETableCell"/>
+            </w:pPr>
+            <w:r>
+              <w:t>QNN superiority over XGBoost</w:t>
+            </w:r>
+          </w:p>
+        </w:tc>
+      </w:tr>
+      <w:tr>
+        <w:tc>
+          <w:tcPr>
+            <w:tcW w:type="dxa" w:w="2571"/>
+          </w:tcPr>
+          <w:p>
+            <w:pPr>
+              <w:pStyle w:val="IEEETableCell"/>
+            </w:pPr>
+            <w:r>
+              <w:t>QML boundary</w:t>
+            </w:r>
+          </w:p>
+        </w:tc>
+        <w:tc>
+          <w:tcPr>
+            <w:tcW w:type="dxa" w:w="2571"/>
+          </w:tcPr>
+          <w:p>
+            <w:pPr>
+              <w:pStyle w:val="IEEETableCell"/>
+            </w:pPr>
+            <w:r>
+              <w:t>Classical capacity control</w:t>
+            </w:r>
+          </w:p>
+        </w:tc>
+        <w:tc>
+          <w:tcPr>
+            <w:tcW w:type="dxa" w:w="2571"/>
+          </w:tcPr>
+          <w:p>
+            <w:pPr>
+              <w:pStyle w:val="IEEETableCell"/>
+            </w:pPr>
+            <w:r>
+              <w:t>Improved QML != quantum predictive advantage</w:t>
+            </w:r>
+          </w:p>
+        </w:tc>
+        <w:tc>
+          <w:tcPr>
+            <w:tcW w:type="dxa" w:w="2571"/>
+          </w:tcPr>
+          <w:p>
+            <w:pPr>
+              <w:pStyle w:val="IEEETableCell"/>
+            </w:pPr>
+            <w:r>
+              <w:t>That quantum design never helps</w:t>
+            </w:r>
+          </w:p>
+        </w:tc>
+      </w:tr>
+      <w:tr>
+        <w:tc>
+          <w:tcPr>
+            <w:tcW w:type="dxa" w:w="2571"/>
+          </w:tcPr>
+          <w:p>
+            <w:pPr>
+              <w:pStyle w:val="IEEETableCell"/>
+            </w:pPr>
+            <w:r>
+              <w:t>Research methodology</w:t>
+            </w:r>
+          </w:p>
+        </w:tc>
+        <w:tc>
+          <w:tcPr>
+            <w:tcW w:type="dxa" w:w="2571"/>
+          </w:tcPr>
+          <w:p>
+            <w:pPr>
+              <w:pStyle w:val="IEEETableCell"/>
+            </w:pPr>
+            <w:r>
+              <w:t>Pre-specified protocols, negative-result preservation</w:t>
+            </w:r>
+          </w:p>
+        </w:tc>
+        <w:tc>
+          <w:tcPr>
+            <w:tcW w:type="dxa" w:w="2571"/>
+          </w:tcPr>
+          <w:p>
+            <w:pPr>
+              <w:pStyle w:val="IEEETableCell"/>
+            </w:pPr>
+            <w:r>
+              <w:t>A disciplined framework resistant to overclaiming</w:t>
+            </w:r>
+          </w:p>
+        </w:tc>
+        <w:tc>
+          <w:tcPr>
+            <w:tcW w:type="dxa" w:w="2571"/>
+          </w:tcPr>
+          <w:p>
+            <w:pPr>
+              <w:pStyle w:val="IEEETableCell"/>
+            </w:pPr>
+            <w:r>
+              <w:t>N/A</w:t>
+            </w:r>
+          </w:p>
+        </w:tc>
+      </w:tr>
+      <w:tr>
+        <w:tc>
+          <w:tcPr>
+            <w:tcW w:type="dxa" w:w="2571"/>
+          </w:tcPr>
+          <w:p>
+            <w:pPr>
+              <w:pStyle w:val="IEEETableCell"/>
+            </w:pPr>
+            <w:r>
+              <w:t>PQC system evaluation</w:t>
+            </w:r>
+          </w:p>
+        </w:tc>
+        <w:tc>
+          <w:tcPr>
+            <w:tcW w:type="dxa" w:w="2571"/>
+          </w:tcPr>
+          <w:p>
+            <w:pPr>
+              <w:pStyle w:val="IEEETableCell"/>
+            </w:pPr>
+            <w:r>
+              <w:t>Real implementations, 30-rep benchmarks; native liboqs backend attempted</w:t>
+            </w:r>
+          </w:p>
+        </w:tc>
+        <w:tc>
+          <w:tcPr>
+            <w:tcW w:type="dxa" w:w="2571"/>
+          </w:tcPr>
+          <w:p>
+            <w:pPr>
+              <w:pStyle w:val="IEEETableCell"/>
+            </w:pPr>
+            <w:r>
+              <w:t>Integration feasibility + real reference-implementation cost</w:t>
+            </w:r>
+          </w:p>
+        </w:tc>
+        <w:tc>
+          <w:tcPr>
+            <w:tcW w:type="dxa" w:w="2571"/>
+          </w:tcPr>
+          <w:p>
+            <w:pPr>
+              <w:pStyle w:val="IEEETableCell"/>
+            </w:pPr>
+            <w:r>
+              <w:t>Universal algorithm performance (native backend unavailable here)</w:t>
+            </w:r>
+          </w:p>
+        </w:tc>
+      </w:tr>
+      <w:tr>
+        <w:tc>
+          <w:tcPr>
+            <w:tcW w:type="dxa" w:w="2571"/>
+          </w:tcPr>
+          <w:p>
+            <w:pPr>
+              <w:pStyle w:val="IEEETableCell"/>
+            </w:pPr>
+            <w:r>
+              <w:t>QKD simulation + cross-validation</w:t>
+            </w:r>
+          </w:p>
+        </w:tc>
+        <w:tc>
+          <w:tcPr>
+            <w:tcW w:type="dxa" w:w="2571"/>
+          </w:tcPr>
+          <w:p>
+            <w:pPr>
+              <w:pStyle w:val="IEEETableCell"/>
+            </w:pPr>
+            <w:r>
+              <w:t>180 protocol-simulator trials + 180 Qiskit circuit trials, 6 matched conditions</w:t>
+            </w:r>
+          </w:p>
+        </w:tc>
+        <w:tc>
+          <w:tcPr>
+            <w:tcW w:type="dxa" w:w="2571"/>
+          </w:tcPr>
+          <w:p>
+            <w:pPr>
+              <w:pStyle w:val="IEEETableCell"/>
+            </w:pPr>
+            <w:r>
+              <w:t>Expected simulator behavior reproduced by two independent implementations</w:t>
+            </w:r>
+          </w:p>
+        </w:tc>
+        <w:tc>
+          <w:tcPr>
+            <w:tcW w:type="dxa" w:w="2571"/>
+          </w:tcPr>
+          <w:p>
+            <w:pPr>
+              <w:pStyle w:val="IEEETableCell"/>
+            </w:pPr>
+            <w:r>
+              <w:t>Physical QKD security</w:t>
+            </w:r>
+          </w:p>
+        </w:tc>
+      </w:tr>
+      <w:tr>
+        <w:tc>
+          <w:tcPr>
+            <w:tcW w:type="dxa" w:w="2571"/>
+          </w:tcPr>
+          <w:p>
+            <w:pPr>
+              <w:pStyle w:val="IEEETableCell"/>
+            </w:pPr>
+            <w:r>
+              <w:t>Integrated systems insight</w:t>
+            </w:r>
+          </w:p>
+        </w:tc>
+        <w:tc>
+          <w:tcPr>
+            <w:tcW w:type="dxa" w:w="2571"/>
+          </w:tcPr>
+          <w:p>
+            <w:pPr>
+              <w:pStyle w:val="IEEETableCell"/>
+            </w:pPr>
+            <w:r>
+              <w:t>Pre-specified routing ablation</w:t>
+            </w:r>
+          </w:p>
+        </w:tc>
+        <w:tc>
+          <w:tcPr>
+            <w:tcW w:type="dxa" w:w="2571"/>
+          </w:tcPr>
+          <w:p>
+            <w:pPr>
+              <w:pStyle w:val="IEEETableCell"/>
+            </w:pPr>
+            <w:r>
+              <w:t>Fraud risk != cryptographic risk</w:t>
+            </w:r>
+          </w:p>
+        </w:tc>
+        <w:tc>
+          <w:tcPr>
+            <w:tcW w:type="dxa" w:w="2571"/>
+          </w:tcPr>
+          <w:p>
+            <w:pPr>
+              <w:pStyle w:val="IEEETableCell"/>
+            </w:pPr>
+            <w:r>
+              <w:t>Risk-adaptive security is universally ineffective</w:t>
+            </w:r>
+          </w:p>
+        </w:tc>
+      </w:tr>
+    </w:tbl>
+    <w:p>
+      <w:pPr>
         <w:pStyle w:val="IEEEParagraph"/>
       </w:pPr>
       <w:r>
-        <w:t>This project's contribution is not claimed as the first system to combine fraud detection with post-quantum or quantum-key-distribution research. Its contribution is methodological: a statistically rigorous, pre-specified, and negative-result-preserving investigation connecting quantum circuit design, classical machine learning, standardized post-quantum cryptography, and simulated quantum-key distribution as sequential decision layers, with every claim traced to a specific measured artifact.</w:t>
+        <w:t>This study's contribution is not claimed as the first system to combine fraud detection with post-quantum or quantum-key-distribution research; it is methodological -- a statistically rigorous, pre-specified, and negative-result-preserving investigation connecting quantum circuit design, classical machine learning, standardized post-quantum cryptography, and simulated quantum-key distribution as sequential decision layers.</w:t>
       </w:r>
     </w:p>
     <w:p>
@@ -1336,10 +4606,373 @@
     </w:p>
     <w:p>
       <w:pPr>
+        <w:pStyle w:val="IEEETableCaption"/>
+      </w:pPr>
+      <w:r>
+        <w:t>TABLE X</w:t>
+      </w:r>
+    </w:p>
+    <w:p>
+      <w:pPr>
+        <w:pStyle w:val="IEEETableCaption"/>
+      </w:pPr>
+      <w:r>
+        <w:t>Negative and Null Results</w:t>
+      </w:r>
+    </w:p>
+    <w:tbl>
+      <w:tblPr>
+        <w:tblStyle w:val="TableGrid"/>
+        <w:tblW w:type="auto" w:w="0"/>
+        <w:tblLook w:firstColumn="1" w:firstRow="1" w:lastColumn="0" w:lastRow="0" w:noHBand="0" w:noVBand="1" w:val="04A0"/>
+      </w:tblPr>
+      <w:tblGrid>
+        <w:gridCol w:w="5142"/>
+        <w:gridCol w:w="5142"/>
+      </w:tblGrid>
+      <w:tr>
+        <w:tc>
+          <w:tcPr>
+            <w:tcW w:type="dxa" w:w="5142"/>
+          </w:tcPr>
+          <w:p>
+            <w:pPr>
+              <w:pStyle w:val="IEEETableHeaderCentered"/>
+            </w:pPr>
+            <w:r>
+              <w:t>Hypothesis</w:t>
+            </w:r>
+          </w:p>
+        </w:tc>
+        <w:tc>
+          <w:tcPr>
+            <w:tcW w:type="dxa" w:w="5142"/>
+          </w:tcPr>
+          <w:p>
+            <w:pPr>
+              <w:pStyle w:val="IEEETableHeaderCentered"/>
+            </w:pPr>
+            <w:r>
+              <w:t>Result</w:t>
+            </w:r>
+          </w:p>
+        </w:tc>
+      </w:tr>
+      <w:tr>
+        <w:tc>
+          <w:tcPr>
+            <w:tcW w:type="dxa" w:w="5142"/>
+          </w:tcPr>
+          <w:p>
+            <w:pPr>
+              <w:pStyle w:val="IEEETableCell"/>
+            </w:pPr>
+            <w:r>
+              <w:t>Quantum beats classical baselines standalone</w:t>
+            </w:r>
+          </w:p>
+        </w:tc>
+        <w:tc>
+          <w:tcPr>
+            <w:tcW w:type="dxa" w:w="5142"/>
+          </w:tcPr>
+          <w:p>
+            <w:pPr>
+              <w:pStyle w:val="IEEETableCell"/>
+            </w:pPr>
+            <w:r>
+              <w:t>Rejected on identical controlled subset</w:t>
+            </w:r>
+          </w:p>
+        </w:tc>
+      </w:tr>
+      <w:tr>
+        <w:tc>
+          <w:tcPr>
+            <w:tcW w:type="dxa" w:w="5142"/>
+          </w:tcPr>
+          <w:p>
+            <w:pPr>
+              <w:pStyle w:val="IEEETableCell"/>
+            </w:pPr>
+            <w:r>
+              <w:t>Chow-Liu structure universally beats generic topology</w:t>
+            </w:r>
+          </w:p>
+        </w:tc>
+        <w:tc>
+          <w:tcPr>
+            <w:tcW w:type="dxa" w:w="5142"/>
+          </w:tcPr>
+          <w:p>
+            <w:pPr>
+              <w:pStyle w:val="IEEETableCell"/>
+            </w:pPr>
+            <w:r>
+              <w:t>Qubit-count dependent; open question</w:t>
+            </w:r>
+          </w:p>
+        </w:tc>
+      </w:tr>
+      <w:tr>
+        <w:tc>
+          <w:tcPr>
+            <w:tcW w:type="dxa" w:w="5142"/>
+          </w:tcPr>
+          <w:p>
+            <w:pPr>
+              <w:pStyle w:val="IEEETableCell"/>
+            </w:pPr>
+            <w:r>
+              <w:t>QBoost beats classical boosting</w:t>
+            </w:r>
+          </w:p>
+        </w:tc>
+        <w:tc>
+          <w:tcPr>
+            <w:tcW w:type="dxa" w:w="5142"/>
+          </w:tcPr>
+          <w:p>
+            <w:pPr>
+              <w:pStyle w:val="IEEETableCell"/>
+            </w:pPr>
+            <w:r>
+              <w:t>Rejected, both solvers</w:t>
+            </w:r>
+          </w:p>
+        </w:tc>
+      </w:tr>
+      <w:tr>
+        <w:tc>
+          <w:tcPr>
+            <w:tcW w:type="dxa" w:w="5142"/>
+          </w:tcPr>
+          <w:p>
+            <w:pPr>
+              <w:pStyle w:val="IEEETableCell"/>
+            </w:pPr>
+            <w:r>
+              <w:t>Hybrid fusion beats XGBoost alone</w:t>
+            </w:r>
+          </w:p>
+        </w:tc>
+        <w:tc>
+          <w:tcPr>
+            <w:tcW w:type="dxa" w:w="5142"/>
+          </w:tcPr>
+          <w:p>
+            <w:pPr>
+              <w:pStyle w:val="IEEETableCell"/>
+            </w:pPr>
+            <w:r>
+              <w:t>Rejected, all five architectures</w:t>
+            </w:r>
+          </w:p>
+        </w:tc>
+      </w:tr>
+      <w:tr>
+        <w:tc>
+          <w:tcPr>
+            <w:tcW w:type="dxa" w:w="5142"/>
+          </w:tcPr>
+          <w:p>
+            <w:pPr>
+              <w:pStyle w:val="IEEETableCell"/>
+            </w:pPr>
+            <w:r>
+              <w:t>Quantum anomaly detector beats classical anomaly detection</w:t>
+            </w:r>
+          </w:p>
+        </w:tc>
+        <w:tc>
+          <w:tcPr>
+            <w:tcW w:type="dxa" w:w="5142"/>
+          </w:tcPr>
+          <w:p>
+            <w:pPr>
+              <w:pStyle w:val="IEEETableCell"/>
+            </w:pPr>
+            <w:r>
+              <w:t>Reversed at larger scale</w:t>
+            </w:r>
+          </w:p>
+        </w:tc>
+      </w:tr>
+      <w:tr>
+        <w:tc>
+          <w:tcPr>
+            <w:tcW w:type="dxa" w:w="5142"/>
+          </w:tcPr>
+          <w:p>
+            <w:pPr>
+              <w:pStyle w:val="IEEETableCell"/>
+            </w:pPr>
+            <w:r>
+              <w:t>Data re-uploading improves QNN</w:t>
+            </w:r>
+          </w:p>
+        </w:tc>
+        <w:tc>
+          <w:tcPr>
+            <w:tcW w:type="dxa" w:w="5142"/>
+          </w:tcPr>
+          <w:p>
+            <w:pPr>
+              <w:pStyle w:val="IEEETableCell"/>
+            </w:pPr>
+            <w:r>
+              <w:t>No improvement, worse variance</w:t>
+            </w:r>
+          </w:p>
+        </w:tc>
+      </w:tr>
+      <w:tr>
+        <w:tc>
+          <w:tcPr>
+            <w:tcW w:type="dxa" w:w="5142"/>
+          </w:tcPr>
+          <w:p>
+            <w:pPr>
+              <w:pStyle w:val="IEEETableCell"/>
+            </w:pPr>
+            <w:r>
+              <w:t>Near-zero initialization improves QNN</w:t>
+            </w:r>
+          </w:p>
+        </w:tc>
+        <w:tc>
+          <w:tcPr>
+            <w:tcW w:type="dxa" w:w="5142"/>
+          </w:tcPr>
+          <w:p>
+            <w:pPr>
+              <w:pStyle w:val="IEEETableCell"/>
+            </w:pPr>
+            <w:r>
+              <w:t>Underperformed existing default</w:t>
+            </w:r>
+          </w:p>
+        </w:tc>
+      </w:tr>
+      <w:tr>
+        <w:tc>
+          <w:tcPr>
+            <w:tcW w:type="dxa" w:w="5142"/>
+          </w:tcPr>
+          <w:p>
+            <w:pPr>
+              <w:pStyle w:val="IEEETableCell"/>
+            </w:pPr>
+            <w:r>
+              <w:t>Local-Sum QNN beats XGBoost / classical control</w:t>
+            </w:r>
+          </w:p>
+        </w:tc>
+        <w:tc>
+          <w:tcPr>
+            <w:tcW w:type="dxa" w:w="5142"/>
+          </w:tcPr>
+          <w:p>
+            <w:pPr>
+              <w:pStyle w:val="IEEETableCell"/>
+            </w:pPr>
+            <w:r>
+              <w:t>Rejected, both comparisons</w:t>
+            </w:r>
+          </w:p>
+        </w:tc>
+      </w:tr>
+      <w:tr>
+        <w:tc>
+          <w:tcPr>
+            <w:tcW w:type="dxa" w:w="5142"/>
+          </w:tcPr>
+          <w:p>
+            <w:pPr>
+              <w:pStyle w:val="IEEETableCell"/>
+            </w:pPr>
+            <w:r>
+              <w:t>Categorical routing differs from continuous routing</w:t>
+            </w:r>
+          </w:p>
+        </w:tc>
+        <w:tc>
+          <w:tcPr>
+            <w:tcW w:type="dxa" w:w="5142"/>
+          </w:tcPr>
+          <w:p>
+            <w:pPr>
+              <w:pStyle w:val="IEEETableCell"/>
+            </w:pPr>
+            <w:r>
+              <w:t>Identical on tested dataset</w:t>
+            </w:r>
+          </w:p>
+        </w:tc>
+      </w:tr>
+      <w:tr>
+        <w:tc>
+          <w:tcPr>
+            <w:tcW w:type="dxa" w:w="5142"/>
+          </w:tcPr>
+          <w:p>
+            <w:pPr>
+              <w:pStyle w:val="IEEETableCell"/>
+            </w:pPr>
+            <w:r>
+              <w:t>Anomaly/quantum-assisted routing improves Layer 2</w:t>
+            </w:r>
+          </w:p>
+        </w:tc>
+        <w:tc>
+          <w:tcPr>
+            <w:tcW w:type="dxa" w:w="5142"/>
+          </w:tcPr>
+          <w:p>
+            <w:pPr>
+              <w:pStyle w:val="IEEETableCell"/>
+            </w:pPr>
+            <w:r>
+              <w:t>Fails pre-specified cost budget</w:t>
+            </w:r>
+          </w:p>
+        </w:tc>
+      </w:tr>
+      <w:tr>
+        <w:tc>
+          <w:tcPr>
+            <w:tcW w:type="dxa" w:w="5142"/>
+          </w:tcPr>
+          <w:p>
+            <w:pPr>
+              <w:pStyle w:val="IEEETableCell"/>
+            </w:pPr>
+            <w:r>
+              <w:t>Native liboqs PQC backend installable in this environment</w:t>
+            </w:r>
+          </w:p>
+        </w:tc>
+        <w:tc>
+          <w:tcPr>
+            <w:tcW w:type="dxa" w:w="5142"/>
+          </w:tcPr>
+          <w:p>
+            <w:pPr>
+              <w:pStyle w:val="IEEETableCell"/>
+            </w:pPr>
+            <w:r>
+              <w:t>Unavailable -- no C/CMake toolchain</w:t>
+            </w:r>
+          </w:p>
+        </w:tc>
+      </w:tr>
+    </w:tbl>
+    <w:p>
+      <w:pPr>
         <w:pStyle w:val="IEEEParagraph"/>
       </w:pPr>
       <w:r>
-        <w:t>The following negative and null findings are reported with the same rigor as positive results: no quantum model or quantum-inclusive hybrid beats its matched classical counterpart anywhere in this project; the Chow-Liu structural circuit benefit is qubit-count dependent against a matched-sparsity control; neither QBoost solver beats classical boosting; the quantum anomaly detector's advantage did not replicate at scale; categorical and continuous security routing are behaviorally identical on the tested dataset; and neither anomaly-assisted nor quantum-assisted routing clears its pre-specified cost budget.</w:t>
+        <w:t>Each entry above narrowed the research question rather than ending it: rejecting a hypothesis under stronger validation is what allowed the Local-Sum observable finding, and the integration experiment's cost-budget rejections, to be trusted as genuine rather than a product of insufficiently rigorous testing.</w:t>
       </w:r>
     </w:p>
     <w:p>
@@ -1355,7 +4988,7 @@
         <w:pStyle w:val="IEEEParagraph"/>
       </w:pPr>
       <w:r>
-        <w:t>This project's quantum experiments operate on a small, rebalanced controlled subset relative to the full production dataset. Post-quantum cryptography benchmarks reflect a pure-Python implementation, not a production-grade native library, and should not be generalized as representative of deployed system performance. No web dashboard, API layer, or concurrency/load testing exists. The integration experiment's null and negative findings were measured on a single dataset and threshold configuration. One of the three supplied project reference documents could not be read due to being a scanned, image-only file.</w:t>
+        <w:t>Quantum experiments operate on a small, rebalanced controlled subset relative to the full production dataset. Post-quantum benchmarks reflect a pure-Python implementation, not a production-grade native library -- a native `liboqs` backend was attempted and found unavailable in this environment (no C/CMake toolchain) -- and should not be generalized as representative of deployed system performance. The Qiskit BB84 cross-validation used a reduced per-trial bit count (200 vs. 2000) to bound simulator overhead. No web dashboard, API layer, or concurrency/load testing exists. The integration experiment's null and negative findings were measured on a single dataset and threshold configuration. One of the three supplied project reference documents could not be read due to being a scanned, image-only file.</w:t>
       </w:r>
     </w:p>
     <w:p>
@@ -1371,7 +5004,7 @@
         <w:pStyle w:val="IEEEParagraph"/>
       </w:pPr>
       <w:r>
-        <w:t>A third layer, addressing classical attacks (man-in-the-middle, replay, brute-force, adversarial machine-learning evasion and poisoning) and quantum attacks (Shor's and Grover's algorithms), remains unimplemented future work. No claim is made in this project that real-world RSA, ECC, or AES have been broken; any future demonstration of Shor's or Grover's algorithms would necessarily operate on illustrative, non-production key sizes, and this distinction must be preserved explicitly in that future work.</w:t>
+        <w:t>A third layer, addressing classical attacks (man-in-the-middle, replay, brute-force, adversarial machine-learning evasion and poisoning) and quantum attacks (Shor's and Grover's algorithms), remains unimplemented future work. No claim is made in this study that real-world RSA, ECC, or AES have been broken; any future demonstration of Shor's or Grover's algorithms would necessarily operate on illustrative, non-production key sizes.</w:t>
       </w:r>
     </w:p>
     <w:p>
@@ -1387,7 +5020,7 @@
         <w:pStyle w:val="IEEEParagraph"/>
       </w:pPr>
       <w:r>
-        <w:t>This project demonstrates a statistically supported, architecture-level quantum machine learning finding (observable locality improves a matched quantum circuit's trainability and standalone performance) alongside equally rigorous evidence that this finding does not extend to a system-level predictive or operational advantage over strong classical methods, in either fraud detection or risk-adaptive security routing. A working, tested, and benchmarked classical and post-quantum cryptographic security layer, integrated with fraud intelligence through an auditable, model-agnostic contract, is delivered alongside this evidence. No claim of quantum advantage or quantum supremacy is made; all conclusions are scoped exactly to their supporting evidence.</w:t>
+        <w:t>This study demonstrates that quantum model architecture can materially affect fraud-detection performance: the local-sum observable produced a statistically supported improvement over the matched global-observable QNN, replicated across 20 paired seeds. However, a strong classical capacity control shows that this improvement does not constitute a verified system-level quantum predictive advantage. In the security layer, standardized post-quantum primitives were successfully integrated with transaction protection but introduce implementation-dependent computational and communication overhead, while the BB84 simulator reproduces expected eavesdropping behavior under controlled conditions. Risk-routing experiments further show that additional quantum- or anomaly-derived signals do not automatically justify their operational cost under a pre-specified budget. Together, these findings identify both useful roles and practical boundaries for quantum technologies within a fraud-aware financial security architecture, and establish, as a central systems-level lesson, that fraud risk and cryptographic quantum risk must be treated as separate architectural concerns.</w:t>
       </w:r>
     </w:p>
     <w:p>

</xml_diff>

<commit_message>
report: fix issues found by real Overleaf compile (bib paths, figure heights, tall diagrams, broken ref, path hygiene); document verified status
University, IEEE and Springer targets compile on Overleaf with 0 errors. Overleaf Workshop sync not verified; project created via web UI.
</commit_message>
<xml_diff>
--- a/Quantum_Secure_Fraud_Detection_System_Final_Report.docx
+++ b/Quantum_Secure_Fraud_Detection_System_Final_Report.docx
@@ -182,7 +182,7 @@
       <w:r>
         <w:drawing>
           <wp:inline xmlns:a="http://schemas.openxmlformats.org/drawingml/2006/main" xmlns:pic="http://schemas.openxmlformats.org/drawingml/2006/picture">
-            <wp:extent cx="2377440" cy="22684740"/>
+            <wp:extent cx="2377440" cy="3507561"/>
             <wp:docPr id="2" name="Picture 2"/>
             <wp:cNvGraphicFramePr>
               <a:graphicFrameLocks noChangeAspect="1"/>
@@ -203,7 +203,7 @@
                   <pic:spPr>
                     <a:xfrm>
                       <a:off x="0" y="0"/>
-                      <a:ext cx="2377440" cy="22684740"/>
+                      <a:ext cx="2377440" cy="3507561"/>
                     </a:xfrm>
                     <a:prstGeom prst="rect"/>
                   </pic:spPr>
@@ -1641,7 +1641,7 @@
       <w:r>
         <w:drawing>
           <wp:inline xmlns:a="http://schemas.openxmlformats.org/drawingml/2006/main" xmlns:pic="http://schemas.openxmlformats.org/drawingml/2006/picture">
-            <wp:extent cx="2377440" cy="14120155"/>
+            <wp:extent cx="2377440" cy="2369256"/>
             <wp:docPr id="11" name="Picture 11"/>
             <wp:cNvGraphicFramePr>
               <a:graphicFrameLocks noChangeAspect="1"/>
@@ -1662,7 +1662,7 @@
                   <pic:spPr>
                     <a:xfrm>
                       <a:off x="0" y="0"/>
-                      <a:ext cx="2377440" cy="14120155"/>
+                      <a:ext cx="2377440" cy="2369256"/>
                     </a:xfrm>
                     <a:prstGeom prst="rect"/>
                   </pic:spPr>
@@ -2069,7 +2069,7 @@
       <w:r>
         <w:drawing>
           <wp:inline xmlns:a="http://schemas.openxmlformats.org/drawingml/2006/main" xmlns:pic="http://schemas.openxmlformats.org/drawingml/2006/picture">
-            <wp:extent cx="2011680" cy="10860677"/>
+            <wp:extent cx="2011680" cy="938243"/>
             <wp:docPr id="15" name="Picture 15"/>
             <wp:cNvGraphicFramePr>
               <a:graphicFrameLocks noChangeAspect="1"/>
@@ -2090,7 +2090,7 @@
                   <pic:spPr>
                     <a:xfrm>
                       <a:off x="0" y="0"/>
-                      <a:ext cx="2011680" cy="10860677"/>
+                      <a:ext cx="2011680" cy="938243"/>
                     </a:xfrm>
                     <a:prstGeom prst="rect"/>
                   </pic:spPr>

</xml_diff>